<commit_message>
Add resourceLinks to JSON export (sections.js)
</commit_message>
<xml_diff>
--- a/data/outputs/v2/Biology/SS2.1_Plant_Nutrition/Biology_Plant_Nutrition_CBE_LessonSequence.docx
+++ b/data/outputs/v2/Biology/SS2.1_Plant_Nutrition/Biology_Plant_Nutrition_CBE_LessonSequence.docx
@@ -3440,7 +3440,7 @@
             <w:pPr>
               <w:spacing w:after="20" w:before="0"/>
             </w:pPr>
-            <w:hyperlink w:history="1" r:id="rId6h4irkws8qdl_ru-afk1s">
+            <w:hyperlink w:history="1" r:id="rIdxylklmk6ho_-djo_bp-yy">
               <w:r>
                 <w:rPr>
                   <w:rFonts w:ascii="Arial" w:cs="Arial" w:eastAsia="Arial" w:hAnsi="Arial"/>
@@ -3473,7 +3473,7 @@
               <w:spacing w:after="10" w:before="0"/>
               <w:ind w:left="120"/>
             </w:pPr>
-            <w:hyperlink w:history="1" r:id="rIdr3kkf-iv_6pbwwkwnffaq">
+            <w:hyperlink w:history="1" r:id="rIda3iwvhsivqacclxtgs1vw">
               <w:r>
                 <w:rPr>
                   <w:rFonts w:ascii="Arial" w:cs="Arial" w:eastAsia="Arial" w:hAnsi="Arial"/>
@@ -3518,7 +3518,7 @@
             <w:pPr>
               <w:spacing w:after="20" w:before="0"/>
             </w:pPr>
-            <w:hyperlink w:history="1" r:id="rIdjupr-ak7ngsn7_q2ckldm">
+            <w:hyperlink w:history="1" r:id="rIdlh_lpzzcvvqfg3eo2r0hu">
               <w:r>
                 <w:rPr>
                   <w:rFonts w:ascii="Arial" w:cs="Arial" w:eastAsia="Arial" w:hAnsi="Arial"/>
@@ -3551,7 +3551,7 @@
               <w:spacing w:after="10" w:before="0"/>
               <w:ind w:left="120"/>
             </w:pPr>
-            <w:hyperlink w:history="1" r:id="rId_gxp2dqn7ugur-h6dkpx6">
+            <w:hyperlink w:history="1" r:id="rIdvzdamjdbfuro311oo6glb">
               <w:r>
                 <w:rPr>
                   <w:rFonts w:ascii="Arial" w:cs="Arial" w:eastAsia="Arial" w:hAnsi="Arial"/>
@@ -3746,7 +3746,7 @@
             <w:pPr>
               <w:spacing w:after="20" w:before="0"/>
             </w:pPr>
-            <w:hyperlink w:history="1" r:id="rIdvvss9bhge24wkxkixjf20">
+            <w:hyperlink w:history="1" r:id="rId_kq8kf8swjjv-yqsg6ja7">
               <w:r>
                 <w:rPr>
                   <w:rFonts w:ascii="Arial" w:cs="Arial" w:eastAsia="Arial" w:hAnsi="Arial"/>
@@ -3779,7 +3779,7 @@
               <w:spacing w:after="10" w:before="0"/>
               <w:ind w:left="120"/>
             </w:pPr>
-            <w:hyperlink w:history="1" r:id="rIdbphfzjxp-aic2pdsrlyjk">
+            <w:hyperlink w:history="1" r:id="rIdjcxbbloa-tx74byg_mmny">
               <w:r>
                 <w:rPr>
                   <w:rFonts w:ascii="Arial" w:cs="Arial" w:eastAsia="Arial" w:hAnsi="Arial"/>
@@ -3824,7 +3824,7 @@
             <w:pPr>
               <w:spacing w:after="20" w:before="0"/>
             </w:pPr>
-            <w:hyperlink w:history="1" r:id="rIdmztpe2d-tqlohmtillcsz">
+            <w:hyperlink w:history="1" r:id="rId_e_g3rubhhm0s6k3zeqbz">
               <w:r>
                 <w:rPr>
                   <w:rFonts w:ascii="Arial" w:cs="Arial" w:eastAsia="Arial" w:hAnsi="Arial"/>
@@ -3857,7 +3857,7 @@
               <w:spacing w:after="10" w:before="0"/>
               <w:ind w:left="120"/>
             </w:pPr>
-            <w:hyperlink w:history="1" r:id="rIdhxlkxkz9gblyrb4szmabd">
+            <w:hyperlink w:history="1" r:id="rIdjwgc0vso0mhdz-w0brro0">
               <w:r>
                 <w:rPr>
                   <w:rFonts w:ascii="Arial" w:cs="Arial" w:eastAsia="Arial" w:hAnsi="Arial"/>
@@ -4052,7 +4052,7 @@
             <w:pPr>
               <w:spacing w:after="20" w:before="0"/>
             </w:pPr>
-            <w:hyperlink w:history="1" r:id="rIdn0z9js_tcl96cqpjzelpx">
+            <w:hyperlink w:history="1" r:id="rIdvjeohm4vfakvqsrrf9tub">
               <w:r>
                 <w:rPr>
                   <w:rFonts w:ascii="Arial" w:cs="Arial" w:eastAsia="Arial" w:hAnsi="Arial"/>
@@ -4085,7 +4085,7 @@
               <w:spacing w:after="10" w:before="0"/>
               <w:ind w:left="120"/>
             </w:pPr>
-            <w:hyperlink w:history="1" r:id="rId1xijtie3cabu2ssp31cio">
+            <w:hyperlink w:history="1" r:id="rIdtuu0cusr0mh0ilipddgsj">
               <w:r>
                 <w:rPr>
                   <w:rFonts w:ascii="Arial" w:cs="Arial" w:eastAsia="Arial" w:hAnsi="Arial"/>
@@ -4130,7 +4130,7 @@
             <w:pPr>
               <w:spacing w:after="20" w:before="0"/>
             </w:pPr>
-            <w:hyperlink w:history="1" r:id="rIdzga9erhcrzl2-6a5hqk91">
+            <w:hyperlink w:history="1" r:id="rIdqgadim7tzygmnsnnn7g0c">
               <w:r>
                 <w:rPr>
                   <w:rFonts w:ascii="Arial" w:cs="Arial" w:eastAsia="Arial" w:hAnsi="Arial"/>
@@ -4163,7 +4163,7 @@
               <w:spacing w:after="10" w:before="0"/>
               <w:ind w:left="120"/>
             </w:pPr>
-            <w:hyperlink w:history="1" r:id="rIdvfvvhcq9xfaanz9f2rkbz">
+            <w:hyperlink w:history="1" r:id="rIdd5yvmfizyecb3bo4dai5b">
               <w:r>
                 <w:rPr>
                   <w:rFonts w:ascii="Arial" w:cs="Arial" w:eastAsia="Arial" w:hAnsi="Arial"/>
@@ -4358,7 +4358,7 @@
             <w:pPr>
               <w:spacing w:after="20" w:before="0"/>
             </w:pPr>
-            <w:hyperlink w:history="1" r:id="rIddovhezmexx5chj3d-m1i1">
+            <w:hyperlink w:history="1" r:id="rIdwjlh4g2grewtftyuaveak">
               <w:r>
                 <w:rPr>
                   <w:rFonts w:ascii="Arial" w:cs="Arial" w:eastAsia="Arial" w:hAnsi="Arial"/>
@@ -4391,7 +4391,7 @@
               <w:spacing w:after="10" w:before="0"/>
               <w:ind w:left="120"/>
             </w:pPr>
-            <w:hyperlink w:history="1" r:id="rIdwryn9xpmeloja6h_87mzp">
+            <w:hyperlink w:history="1" r:id="rId4szwov5ycooyoueofld4l">
               <w:r>
                 <w:rPr>
                   <w:rFonts w:ascii="Arial" w:cs="Arial" w:eastAsia="Arial" w:hAnsi="Arial"/>
@@ -4436,7 +4436,7 @@
             <w:pPr>
               <w:spacing w:after="20" w:before="0"/>
             </w:pPr>
-            <w:hyperlink w:history="1" r:id="rIdkythawdhe9hkk_7z-tbyr">
+            <w:hyperlink w:history="1" r:id="rIdyvjukdlocsrs7ceyrw_o2">
               <w:r>
                 <w:rPr>
                   <w:rFonts w:ascii="Arial" w:cs="Arial" w:eastAsia="Arial" w:hAnsi="Arial"/>
@@ -4469,7 +4469,7 @@
               <w:spacing w:after="10" w:before="0"/>
               <w:ind w:left="120"/>
             </w:pPr>
-            <w:hyperlink w:history="1" r:id="rIdjwehiboozvx9w5x3dwrdr">
+            <w:hyperlink w:history="1" r:id="rId1csmsqeyed7yrx3trmyc3">
               <w:r>
                 <w:rPr>
                   <w:rFonts w:ascii="Arial" w:cs="Arial" w:eastAsia="Arial" w:hAnsi="Arial"/>
@@ -4664,7 +4664,7 @@
             <w:pPr>
               <w:spacing w:after="20" w:before="0"/>
             </w:pPr>
-            <w:hyperlink w:history="1" r:id="rIdfbj5ysvccu46a1khepeyz">
+            <w:hyperlink w:history="1" r:id="rIdbdgwa5gphzs5l4r7-g4vq">
               <w:r>
                 <w:rPr>
                   <w:rFonts w:ascii="Arial" w:cs="Arial" w:eastAsia="Arial" w:hAnsi="Arial"/>
@@ -4697,7 +4697,7 @@
               <w:spacing w:after="10" w:before="0"/>
               <w:ind w:left="120"/>
             </w:pPr>
-            <w:hyperlink w:history="1" r:id="rId9t5d6g2intvzzj9_ls_if">
+            <w:hyperlink w:history="1" r:id="rIduuithh1t6eqeqqmku9jq6">
               <w:r>
                 <w:rPr>
                   <w:rFonts w:ascii="Arial" w:cs="Arial" w:eastAsia="Arial" w:hAnsi="Arial"/>
@@ -4742,7 +4742,7 @@
             <w:pPr>
               <w:spacing w:after="20" w:before="0"/>
             </w:pPr>
-            <w:hyperlink w:history="1" r:id="rIdzr2uddzycocuzjxuuuxdq">
+            <w:hyperlink w:history="1" r:id="rIdy5i75b8vrfdkgjqijk6kq">
               <w:r>
                 <w:rPr>
                   <w:rFonts w:ascii="Arial" w:cs="Arial" w:eastAsia="Arial" w:hAnsi="Arial"/>
@@ -4775,7 +4775,7 @@
               <w:spacing w:after="10" w:before="0"/>
               <w:ind w:left="120"/>
             </w:pPr>
-            <w:hyperlink w:history="1" r:id="rIdfa0vcyb6ll5l0qtdcrjje">
+            <w:hyperlink w:history="1" r:id="rIdh0mjfffl8qaqyd9gylopr">
               <w:r>
                 <w:rPr>
                   <w:rFonts w:ascii="Arial" w:cs="Arial" w:eastAsia="Arial" w:hAnsi="Arial"/>
@@ -6262,7 +6262,7 @@
             <w:pPr>
               <w:spacing w:after="20" w:before="0"/>
             </w:pPr>
-            <w:hyperlink w:history="1" r:id="rIdfawkahvj0qgblkdhu018a">
+            <w:hyperlink w:history="1" r:id="rIdmabmtch5z9dy3_esuwqvj">
               <w:r>
                 <w:rPr>
                   <w:rFonts w:ascii="Arial" w:cs="Arial" w:eastAsia="Arial" w:hAnsi="Arial"/>
@@ -6295,7 +6295,7 @@
               <w:spacing w:after="10" w:before="0"/>
               <w:ind w:left="120"/>
             </w:pPr>
-            <w:hyperlink w:history="1" r:id="rIdmxbclaeso0cbwifxcn-v3">
+            <w:hyperlink w:history="1" r:id="rIdebo-vtircxdsmplz3vlck">
               <w:r>
                 <w:rPr>
                   <w:rFonts w:ascii="Arial" w:cs="Arial" w:eastAsia="Arial" w:hAnsi="Arial"/>
@@ -6340,7 +6340,7 @@
             <w:pPr>
               <w:spacing w:after="20" w:before="0"/>
             </w:pPr>
-            <w:hyperlink w:history="1" r:id="rIdenu_5uyt8-igpgi30hbty">
+            <w:hyperlink w:history="1" r:id="rIdzrn2cibim2bjl7dhgol1v">
               <w:r>
                 <w:rPr>
                   <w:rFonts w:ascii="Arial" w:cs="Arial" w:eastAsia="Arial" w:hAnsi="Arial"/>
@@ -6373,7 +6373,7 @@
               <w:spacing w:after="10" w:before="0"/>
               <w:ind w:left="120"/>
             </w:pPr>
-            <w:hyperlink w:history="1" r:id="rIdzxqjae8bkqjbx9cm0oxne">
+            <w:hyperlink w:history="1" r:id="rIdvxsyzawtwtdw1y5rstswb">
               <w:r>
                 <w:rPr>
                   <w:rFonts w:ascii="Arial" w:cs="Arial" w:eastAsia="Arial" w:hAnsi="Arial"/>
@@ -6568,7 +6568,7 @@
             <w:pPr>
               <w:spacing w:after="20" w:before="0"/>
             </w:pPr>
-            <w:hyperlink w:history="1" r:id="rIdg8btiu9ellbat1cyf1ouq">
+            <w:hyperlink w:history="1" r:id="rIdvpf1jhmcusagfrkpes3hk">
               <w:r>
                 <w:rPr>
                   <w:rFonts w:ascii="Arial" w:cs="Arial" w:eastAsia="Arial" w:hAnsi="Arial"/>
@@ -6601,7 +6601,7 @@
               <w:spacing w:after="10" w:before="0"/>
               <w:ind w:left="120"/>
             </w:pPr>
-            <w:hyperlink w:history="1" r:id="rId19uatq1az8arijndf9vi_">
+            <w:hyperlink w:history="1" r:id="rIdjvvfxdez8fwwz99funru1">
               <w:r>
                 <w:rPr>
                   <w:rFonts w:ascii="Arial" w:cs="Arial" w:eastAsia="Arial" w:hAnsi="Arial"/>
@@ -6646,7 +6646,7 @@
             <w:pPr>
               <w:spacing w:after="20" w:before="0"/>
             </w:pPr>
-            <w:hyperlink w:history="1" r:id="rIdend0tuwmktx6bbkayft4q">
+            <w:hyperlink w:history="1" r:id="rIdqy4ste_faqfarnxiqwibo">
               <w:r>
                 <w:rPr>
                   <w:rFonts w:ascii="Arial" w:cs="Arial" w:eastAsia="Arial" w:hAnsi="Arial"/>
@@ -6679,7 +6679,7 @@
               <w:spacing w:after="10" w:before="0"/>
               <w:ind w:left="120"/>
             </w:pPr>
-            <w:hyperlink w:history="1" r:id="rIdgdby0pkpygvuaebqckmyd">
+            <w:hyperlink w:history="1" r:id="rIdye3vb95uebkp2ng6m9iry">
               <w:r>
                 <w:rPr>
                   <w:rFonts w:ascii="Arial" w:cs="Arial" w:eastAsia="Arial" w:hAnsi="Arial"/>
@@ -6874,7 +6874,7 @@
             <w:pPr>
               <w:spacing w:after="20" w:before="0"/>
             </w:pPr>
-            <w:hyperlink w:history="1" r:id="rIdlg_hlsethuephsywoo7c8">
+            <w:hyperlink w:history="1" r:id="rId-o0beefu83z_zv1bxue12">
               <w:r>
                 <w:rPr>
                   <w:rFonts w:ascii="Arial" w:cs="Arial" w:eastAsia="Arial" w:hAnsi="Arial"/>
@@ -6907,7 +6907,7 @@
               <w:spacing w:after="10" w:before="0"/>
               <w:ind w:left="120"/>
             </w:pPr>
-            <w:hyperlink w:history="1" r:id="rId2zy5dpwpikfshdw-sf6oe">
+            <w:hyperlink w:history="1" r:id="rIdeqaimyw5iz0shhkrpkl4f">
               <w:r>
                 <w:rPr>
                   <w:rFonts w:ascii="Arial" w:cs="Arial" w:eastAsia="Arial" w:hAnsi="Arial"/>
@@ -6952,7 +6952,7 @@
             <w:pPr>
               <w:spacing w:after="20" w:before="0"/>
             </w:pPr>
-            <w:hyperlink w:history="1" r:id="rIdikl4-xahuzlapxyqxnkda">
+            <w:hyperlink w:history="1" r:id="rIdntkljsu9viqrxb4hy80_y">
               <w:r>
                 <w:rPr>
                   <w:rFonts w:ascii="Arial" w:cs="Arial" w:eastAsia="Arial" w:hAnsi="Arial"/>
@@ -6985,7 +6985,7 @@
               <w:spacing w:after="10" w:before="0"/>
               <w:ind w:left="120"/>
             </w:pPr>
-            <w:hyperlink w:history="1" r:id="rIdyw3ppwiqygxlrqkir6jr2">
+            <w:hyperlink w:history="1" r:id="rId013uue49xgvfa3eu07rwc">
               <w:r>
                 <w:rPr>
                   <w:rFonts w:ascii="Arial" w:cs="Arial" w:eastAsia="Arial" w:hAnsi="Arial"/>
@@ -7180,7 +7180,7 @@
             <w:pPr>
               <w:spacing w:after="20" w:before="0"/>
             </w:pPr>
-            <w:hyperlink w:history="1" r:id="rIdtlz_h7n87xfwt3zq8zv13">
+            <w:hyperlink w:history="1" r:id="rIdrrzzxlj5nvz9kkyeb2_rt">
               <w:r>
                 <w:rPr>
                   <w:rFonts w:ascii="Arial" w:cs="Arial" w:eastAsia="Arial" w:hAnsi="Arial"/>
@@ -7213,7 +7213,7 @@
               <w:spacing w:after="10" w:before="0"/>
               <w:ind w:left="120"/>
             </w:pPr>
-            <w:hyperlink w:history="1" r:id="rIdl9et5a2cy3fkmgb4l5qbl">
+            <w:hyperlink w:history="1" r:id="rIduphzxvvaltr08h5bhmpbd">
               <w:r>
                 <w:rPr>
                   <w:rFonts w:ascii="Arial" w:cs="Arial" w:eastAsia="Arial" w:hAnsi="Arial"/>
@@ -7258,7 +7258,7 @@
             <w:pPr>
               <w:spacing w:after="20" w:before="0"/>
             </w:pPr>
-            <w:hyperlink w:history="1" r:id="rIdmb2bc5zd8q5mkkenppfhe">
+            <w:hyperlink w:history="1" r:id="rIdqar2j2poqlbbxwdzkgrfk">
               <w:r>
                 <w:rPr>
                   <w:rFonts w:ascii="Arial" w:cs="Arial" w:eastAsia="Arial" w:hAnsi="Arial"/>
@@ -7291,7 +7291,7 @@
               <w:spacing w:after="10" w:before="0"/>
               <w:ind w:left="120"/>
             </w:pPr>
-            <w:hyperlink w:history="1" r:id="rIdcx_liqmmvftjp3ks8bd3j">
+            <w:hyperlink w:history="1" r:id="rIdiqobcju4cuewlimc_ephf">
               <w:r>
                 <w:rPr>
                   <w:rFonts w:ascii="Arial" w:cs="Arial" w:eastAsia="Arial" w:hAnsi="Arial"/>
@@ -7486,7 +7486,7 @@
             <w:pPr>
               <w:spacing w:after="20" w:before="0"/>
             </w:pPr>
-            <w:hyperlink w:history="1" r:id="rIdcccqbszplqgzztysmania">
+            <w:hyperlink w:history="1" r:id="rIdoqml_sc3mbok8tic9yqm8">
               <w:r>
                 <w:rPr>
                   <w:rFonts w:ascii="Arial" w:cs="Arial" w:eastAsia="Arial" w:hAnsi="Arial"/>
@@ -7519,7 +7519,7 @@
               <w:spacing w:after="10" w:before="0"/>
               <w:ind w:left="120"/>
             </w:pPr>
-            <w:hyperlink w:history="1" r:id="rId5xhu_ypwj8erbfu2fdvz6">
+            <w:hyperlink w:history="1" r:id="rIdlqrqfcsrwax_ywcd1aozi">
               <w:r>
                 <w:rPr>
                   <w:rFonts w:ascii="Arial" w:cs="Arial" w:eastAsia="Arial" w:hAnsi="Arial"/>
@@ -7564,7 +7564,7 @@
             <w:pPr>
               <w:spacing w:after="20" w:before="0"/>
             </w:pPr>
-            <w:hyperlink w:history="1" r:id="rIdrw3pltwbzbeezkilpdmpv">
+            <w:hyperlink w:history="1" r:id="rIdqee3mik6rwkadegzbxdt_">
               <w:r>
                 <w:rPr>
                   <w:rFonts w:ascii="Arial" w:cs="Arial" w:eastAsia="Arial" w:hAnsi="Arial"/>
@@ -7597,7 +7597,7 @@
               <w:spacing w:after="10" w:before="0"/>
               <w:ind w:left="120"/>
             </w:pPr>
-            <w:hyperlink w:history="1" r:id="rId1pcnvftrubzr6zvpawywy">
+            <w:hyperlink w:history="1" r:id="rIdyjs3v7cjopvjxjsjuyixu">
               <w:r>
                 <w:rPr>
                   <w:rFonts w:ascii="Arial" w:cs="Arial" w:eastAsia="Arial" w:hAnsi="Arial"/>
@@ -9084,7 +9084,7 @@
             <w:pPr>
               <w:spacing w:after="20" w:before="0"/>
             </w:pPr>
-            <w:hyperlink w:history="1" r:id="rIdosifrtrzlfmyqxmig6d7o">
+            <w:hyperlink w:history="1" r:id="rId3eht4lufkwb4f85xuwuja">
               <w:r>
                 <w:rPr>
                   <w:rFonts w:ascii="Arial" w:cs="Arial" w:eastAsia="Arial" w:hAnsi="Arial"/>
@@ -9117,7 +9117,7 @@
               <w:spacing w:after="10" w:before="0"/>
               <w:ind w:left="120"/>
             </w:pPr>
-            <w:hyperlink w:history="1" r:id="rIduffjkmbpql--ehc-y8d-c">
+            <w:hyperlink w:history="1" r:id="rIdyed3rd1wfuro36oav9vst">
               <w:r>
                 <w:rPr>
                   <w:rFonts w:ascii="Arial" w:cs="Arial" w:eastAsia="Arial" w:hAnsi="Arial"/>
@@ -9162,7 +9162,7 @@
             <w:pPr>
               <w:spacing w:after="20" w:before="0"/>
             </w:pPr>
-            <w:hyperlink w:history="1" r:id="rIdavw_zetyssny0kom3dv9-">
+            <w:hyperlink w:history="1" r:id="rId0_xlvycg85ggn2aaa7wyr">
               <w:r>
                 <w:rPr>
                   <w:rFonts w:ascii="Arial" w:cs="Arial" w:eastAsia="Arial" w:hAnsi="Arial"/>
@@ -9195,7 +9195,7 @@
               <w:spacing w:after="10" w:before="0"/>
               <w:ind w:left="120"/>
             </w:pPr>
-            <w:hyperlink w:history="1" r:id="rIdhi2z7n7redrjfalysjiwp">
+            <w:hyperlink w:history="1" r:id="rIdwge1b4klkzlmj_zf0udrr">
               <w:r>
                 <w:rPr>
                   <w:rFonts w:ascii="Arial" w:cs="Arial" w:eastAsia="Arial" w:hAnsi="Arial"/>
@@ -9390,7 +9390,7 @@
             <w:pPr>
               <w:spacing w:after="20" w:before="0"/>
             </w:pPr>
-            <w:hyperlink w:history="1" r:id="rIdyyn85kgvheuitj8e6stpy">
+            <w:hyperlink w:history="1" r:id="rIdtmqpox8lh5ukeoa96ecsi">
               <w:r>
                 <w:rPr>
                   <w:rFonts w:ascii="Arial" w:cs="Arial" w:eastAsia="Arial" w:hAnsi="Arial"/>
@@ -9423,7 +9423,7 @@
               <w:spacing w:after="10" w:before="0"/>
               <w:ind w:left="120"/>
             </w:pPr>
-            <w:hyperlink w:history="1" r:id="rIddu0_myszbxwspk_vbksdy">
+            <w:hyperlink w:history="1" r:id="rIdwtnquumu4bacer6ow_8nl">
               <w:r>
                 <w:rPr>
                   <w:rFonts w:ascii="Arial" w:cs="Arial" w:eastAsia="Arial" w:hAnsi="Arial"/>
@@ -9468,7 +9468,7 @@
             <w:pPr>
               <w:spacing w:after="20" w:before="0"/>
             </w:pPr>
-            <w:hyperlink w:history="1" r:id="rIdprujbucxxekneq4emvien">
+            <w:hyperlink w:history="1" r:id="rIdanqu0krfb0hntaczkudx3">
               <w:r>
                 <w:rPr>
                   <w:rFonts w:ascii="Arial" w:cs="Arial" w:eastAsia="Arial" w:hAnsi="Arial"/>
@@ -9501,7 +9501,7 @@
               <w:spacing w:after="10" w:before="0"/>
               <w:ind w:left="120"/>
             </w:pPr>
-            <w:hyperlink w:history="1" r:id="rIdi290p9ou8vz7qymewgtlx">
+            <w:hyperlink w:history="1" r:id="rIdmxzfbeizp8xdgysu1ramt">
               <w:r>
                 <w:rPr>
                   <w:rFonts w:ascii="Arial" w:cs="Arial" w:eastAsia="Arial" w:hAnsi="Arial"/>
@@ -9696,7 +9696,7 @@
             <w:pPr>
               <w:spacing w:after="20" w:before="0"/>
             </w:pPr>
-            <w:hyperlink w:history="1" r:id="rIdgqcurftrwohasvrxjpcrg">
+            <w:hyperlink w:history="1" r:id="rIdv4koye37jv0f1pwuyk_lm">
               <w:r>
                 <w:rPr>
                   <w:rFonts w:ascii="Arial" w:cs="Arial" w:eastAsia="Arial" w:hAnsi="Arial"/>
@@ -9729,7 +9729,7 @@
               <w:spacing w:after="10" w:before="0"/>
               <w:ind w:left="120"/>
             </w:pPr>
-            <w:hyperlink w:history="1" r:id="rId-y-oxpeiw4r_xivcyrdyo">
+            <w:hyperlink w:history="1" r:id="rIdvejle6jbr2fufzgtvfkgw">
               <w:r>
                 <w:rPr>
                   <w:rFonts w:ascii="Arial" w:cs="Arial" w:eastAsia="Arial" w:hAnsi="Arial"/>
@@ -9774,7 +9774,7 @@
             <w:pPr>
               <w:spacing w:after="20" w:before="0"/>
             </w:pPr>
-            <w:hyperlink w:history="1" r:id="rIdbygb-jgtwedvaqfuw7ayf">
+            <w:hyperlink w:history="1" r:id="rId23kddlvws81xlin-cteol">
               <w:r>
                 <w:rPr>
                   <w:rFonts w:ascii="Arial" w:cs="Arial" w:eastAsia="Arial" w:hAnsi="Arial"/>
@@ -9807,7 +9807,7 @@
               <w:spacing w:after="10" w:before="0"/>
               <w:ind w:left="120"/>
             </w:pPr>
-            <w:hyperlink w:history="1" r:id="rIdfw3yj89gvynzhs931n_w5">
+            <w:hyperlink w:history="1" r:id="rIdboplda8syp-ppcotc1fwf">
               <w:r>
                 <w:rPr>
                   <w:rFonts w:ascii="Arial" w:cs="Arial" w:eastAsia="Arial" w:hAnsi="Arial"/>
@@ -10002,7 +10002,7 @@
             <w:pPr>
               <w:spacing w:after="20" w:before="0"/>
             </w:pPr>
-            <w:hyperlink w:history="1" r:id="rIdob_bzn_qzlya1atfrtu4z">
+            <w:hyperlink w:history="1" r:id="rIdltoyvikk0gw3tg2tnxian">
               <w:r>
                 <w:rPr>
                   <w:rFonts w:ascii="Arial" w:cs="Arial" w:eastAsia="Arial" w:hAnsi="Arial"/>
@@ -10035,7 +10035,7 @@
               <w:spacing w:after="10" w:before="0"/>
               <w:ind w:left="120"/>
             </w:pPr>
-            <w:hyperlink w:history="1" r:id="rIdvgwmk4r61rd1dkrgymf7u">
+            <w:hyperlink w:history="1" r:id="rIds_sp9-pk3p5nwmlsp4gei">
               <w:r>
                 <w:rPr>
                   <w:rFonts w:ascii="Arial" w:cs="Arial" w:eastAsia="Arial" w:hAnsi="Arial"/>
@@ -10080,7 +10080,7 @@
             <w:pPr>
               <w:spacing w:after="20" w:before="0"/>
             </w:pPr>
-            <w:hyperlink w:history="1" r:id="rIdlrs-na-79a19uk1u3-sc5">
+            <w:hyperlink w:history="1" r:id="rIdyhf9cldyxiafprqz9puji">
               <w:r>
                 <w:rPr>
                   <w:rFonts w:ascii="Arial" w:cs="Arial" w:eastAsia="Arial" w:hAnsi="Arial"/>
@@ -10113,7 +10113,7 @@
               <w:spacing w:after="10" w:before="0"/>
               <w:ind w:left="120"/>
             </w:pPr>
-            <w:hyperlink w:history="1" r:id="rIdodmymop_mhkn3tr3bp1a9">
+            <w:hyperlink w:history="1" r:id="rId0iefh145isymwmiek9cab">
               <w:r>
                 <w:rPr>
                   <w:rFonts w:ascii="Arial" w:cs="Arial" w:eastAsia="Arial" w:hAnsi="Arial"/>
@@ -10308,7 +10308,7 @@
             <w:pPr>
               <w:spacing w:after="20" w:before="0"/>
             </w:pPr>
-            <w:hyperlink w:history="1" r:id="rIdgg_z3-mhv1m3ct5sycdk0">
+            <w:hyperlink w:history="1" r:id="rIdbntpx4lgevz5kys2nuzkk">
               <w:r>
                 <w:rPr>
                   <w:rFonts w:ascii="Arial" w:cs="Arial" w:eastAsia="Arial" w:hAnsi="Arial"/>
@@ -10341,7 +10341,7 @@
               <w:spacing w:after="10" w:before="0"/>
               <w:ind w:left="120"/>
             </w:pPr>
-            <w:hyperlink w:history="1" r:id="rIdw7vuqsdxh1_1pscgsi4rv">
+            <w:hyperlink w:history="1" r:id="rIdkybwu4u0zdkcf1mvjcl6k">
               <w:r>
                 <w:rPr>
                   <w:rFonts w:ascii="Arial" w:cs="Arial" w:eastAsia="Arial" w:hAnsi="Arial"/>
@@ -10386,7 +10386,7 @@
             <w:pPr>
               <w:spacing w:after="20" w:before="0"/>
             </w:pPr>
-            <w:hyperlink w:history="1" r:id="rIdgkmtpmek1uyfz4lgkj-tq">
+            <w:hyperlink w:history="1" r:id="rIdct5u6pxqiumpiqdwgr85g">
               <w:r>
                 <w:rPr>
                   <w:rFonts w:ascii="Arial" w:cs="Arial" w:eastAsia="Arial" w:hAnsi="Arial"/>
@@ -10419,7 +10419,7 @@
               <w:spacing w:after="10" w:before="0"/>
               <w:ind w:left="120"/>
             </w:pPr>
-            <w:hyperlink w:history="1" r:id="rId_joxldve8pkjyis0lxp2r">
+            <w:hyperlink w:history="1" r:id="rId3514v2tzquf2wh5webrn0">
               <w:r>
                 <w:rPr>
                   <w:rFonts w:ascii="Arial" w:cs="Arial" w:eastAsia="Arial" w:hAnsi="Arial"/>
@@ -11906,7 +11906,7 @@
             <w:pPr>
               <w:spacing w:after="20" w:before="0"/>
             </w:pPr>
-            <w:hyperlink w:history="1" r:id="rIdsn2sx9x9kbjecnb0rp1yu">
+            <w:hyperlink w:history="1" r:id="rIdzn2r5aqv8ytwqczplsjp5">
               <w:r>
                 <w:rPr>
                   <w:rFonts w:ascii="Arial" w:cs="Arial" w:eastAsia="Arial" w:hAnsi="Arial"/>
@@ -11939,7 +11939,7 @@
               <w:spacing w:after="10" w:before="0"/>
               <w:ind w:left="120"/>
             </w:pPr>
-            <w:hyperlink w:history="1" r:id="rId6xrvysj_zfw8xjcb9q--4">
+            <w:hyperlink w:history="1" r:id="rIdwtmpxvte3he9n2ryvhcox">
               <w:r>
                 <w:rPr>
                   <w:rFonts w:ascii="Arial" w:cs="Arial" w:eastAsia="Arial" w:hAnsi="Arial"/>
@@ -11984,7 +11984,7 @@
             <w:pPr>
               <w:spacing w:after="20" w:before="0"/>
             </w:pPr>
-            <w:hyperlink w:history="1" r:id="rId2nhgfd2ruhnajypvwwku_">
+            <w:hyperlink w:history="1" r:id="rIdivbf5va8diedhnre44nst">
               <w:r>
                 <w:rPr>
                   <w:rFonts w:ascii="Arial" w:cs="Arial" w:eastAsia="Arial" w:hAnsi="Arial"/>
@@ -12017,7 +12017,7 @@
               <w:spacing w:after="10" w:before="0"/>
               <w:ind w:left="120"/>
             </w:pPr>
-            <w:hyperlink w:history="1" r:id="rIddvshxl6jeqzpdqf-julgm">
+            <w:hyperlink w:history="1" r:id="rIdahzydi5dzfifbzfwallut">
               <w:r>
                 <w:rPr>
                   <w:rFonts w:ascii="Arial" w:cs="Arial" w:eastAsia="Arial" w:hAnsi="Arial"/>
@@ -12212,7 +12212,7 @@
             <w:pPr>
               <w:spacing w:after="20" w:before="0"/>
             </w:pPr>
-            <w:hyperlink w:history="1" r:id="rIdy06psu5zr0bqnfpxf6pck">
+            <w:hyperlink w:history="1" r:id="rIdxvbzlv09ngimsfpeyhl-k">
               <w:r>
                 <w:rPr>
                   <w:rFonts w:ascii="Arial" w:cs="Arial" w:eastAsia="Arial" w:hAnsi="Arial"/>
@@ -12245,7 +12245,7 @@
               <w:spacing w:after="10" w:before="0"/>
               <w:ind w:left="120"/>
             </w:pPr>
-            <w:hyperlink w:history="1" r:id="rIdhuyigcjzccypuaf3be2xc">
+            <w:hyperlink w:history="1" r:id="rIds7hzsu7t2q4lo-hjxrbf2">
               <w:r>
                 <w:rPr>
                   <w:rFonts w:ascii="Arial" w:cs="Arial" w:eastAsia="Arial" w:hAnsi="Arial"/>
@@ -12290,7 +12290,7 @@
             <w:pPr>
               <w:spacing w:after="20" w:before="0"/>
             </w:pPr>
-            <w:hyperlink w:history="1" r:id="rIdvcwop_rlfesnfqxkvoe_o">
+            <w:hyperlink w:history="1" r:id="rIdfllddxdea2tceqox5gzt5">
               <w:r>
                 <w:rPr>
                   <w:rFonts w:ascii="Arial" w:cs="Arial" w:eastAsia="Arial" w:hAnsi="Arial"/>
@@ -12323,7 +12323,7 @@
               <w:spacing w:after="10" w:before="0"/>
               <w:ind w:left="120"/>
             </w:pPr>
-            <w:hyperlink w:history="1" r:id="rIdww0o017m4cm7ao5cen8bp">
+            <w:hyperlink w:history="1" r:id="rIda_4mitrlka97xkdakxtip">
               <w:r>
                 <w:rPr>
                   <w:rFonts w:ascii="Arial" w:cs="Arial" w:eastAsia="Arial" w:hAnsi="Arial"/>
@@ -12518,7 +12518,7 @@
             <w:pPr>
               <w:spacing w:after="20" w:before="0"/>
             </w:pPr>
-            <w:hyperlink w:history="1" r:id="rIddoxubhogcq7ycml24fuyi">
+            <w:hyperlink w:history="1" r:id="rId9cmvufb2ihjwkbsaldpky">
               <w:r>
                 <w:rPr>
                   <w:rFonts w:ascii="Arial" w:cs="Arial" w:eastAsia="Arial" w:hAnsi="Arial"/>
@@ -12551,7 +12551,7 @@
               <w:spacing w:after="10" w:before="0"/>
               <w:ind w:left="120"/>
             </w:pPr>
-            <w:hyperlink w:history="1" r:id="rIdqshgxwgbgnv97gn-ms8zf">
+            <w:hyperlink w:history="1" r:id="rIdjxul2jk1sb8ki3bhxynzs">
               <w:r>
                 <w:rPr>
                   <w:rFonts w:ascii="Arial" w:cs="Arial" w:eastAsia="Arial" w:hAnsi="Arial"/>
@@ -12596,7 +12596,7 @@
             <w:pPr>
               <w:spacing w:after="20" w:before="0"/>
             </w:pPr>
-            <w:hyperlink w:history="1" r:id="rId4fm7o2lf0k0yhvzk-z7re">
+            <w:hyperlink w:history="1" r:id="rIdpdar-mvev7xelddvw2p9i">
               <w:r>
                 <w:rPr>
                   <w:rFonts w:ascii="Arial" w:cs="Arial" w:eastAsia="Arial" w:hAnsi="Arial"/>
@@ -12629,7 +12629,7 @@
               <w:spacing w:after="10" w:before="0"/>
               <w:ind w:left="120"/>
             </w:pPr>
-            <w:hyperlink w:history="1" r:id="rIdhwnlo1gmyzyquz_ulqzxe">
+            <w:hyperlink w:history="1" r:id="rIdukgvm95cdlce_tygcqw8w">
               <w:r>
                 <w:rPr>
                   <w:rFonts w:ascii="Arial" w:cs="Arial" w:eastAsia="Arial" w:hAnsi="Arial"/>
@@ -12824,7 +12824,7 @@
             <w:pPr>
               <w:spacing w:after="20" w:before="0"/>
             </w:pPr>
-            <w:hyperlink w:history="1" r:id="rIdf4kha11u1qglgfggvqqis">
+            <w:hyperlink w:history="1" r:id="rId_tsa3hwn-e3pqv-ga1n-y">
               <w:r>
                 <w:rPr>
                   <w:rFonts w:ascii="Arial" w:cs="Arial" w:eastAsia="Arial" w:hAnsi="Arial"/>
@@ -12857,7 +12857,7 @@
               <w:spacing w:after="10" w:before="0"/>
               <w:ind w:left="120"/>
             </w:pPr>
-            <w:hyperlink w:history="1" r:id="rIdslo0ewsxksfdetcrzfdaw">
+            <w:hyperlink w:history="1" r:id="rIdvu2wjcsrmnbnw6mxnymb_">
               <w:r>
                 <w:rPr>
                   <w:rFonts w:ascii="Arial" w:cs="Arial" w:eastAsia="Arial" w:hAnsi="Arial"/>
@@ -12902,7 +12902,7 @@
             <w:pPr>
               <w:spacing w:after="20" w:before="0"/>
             </w:pPr>
-            <w:hyperlink w:history="1" r:id="rIdrxj5domj70iicr13psddt">
+            <w:hyperlink w:history="1" r:id="rIdms9hgjqe3jg9pt-rsqto9">
               <w:r>
                 <w:rPr>
                   <w:rFonts w:ascii="Arial" w:cs="Arial" w:eastAsia="Arial" w:hAnsi="Arial"/>
@@ -12935,7 +12935,7 @@
               <w:spacing w:after="10" w:before="0"/>
               <w:ind w:left="120"/>
             </w:pPr>
-            <w:hyperlink w:history="1" r:id="rIdxd3hd5hztxc0oobcyhsp-">
+            <w:hyperlink w:history="1" r:id="rIdd60ajif2x8f9w1j1mxxwh">
               <w:r>
                 <w:rPr>
                   <w:rFonts w:ascii="Arial" w:cs="Arial" w:eastAsia="Arial" w:hAnsi="Arial"/>
@@ -13130,7 +13130,7 @@
             <w:pPr>
               <w:spacing w:after="20" w:before="0"/>
             </w:pPr>
-            <w:hyperlink w:history="1" r:id="rIdmrb_fnptmb9s_i32zminr">
+            <w:hyperlink w:history="1" r:id="rIdhpci8ku2bv6gpgihfoer_">
               <w:r>
                 <w:rPr>
                   <w:rFonts w:ascii="Arial" w:cs="Arial" w:eastAsia="Arial" w:hAnsi="Arial"/>
@@ -13163,7 +13163,7 @@
               <w:spacing w:after="10" w:before="0"/>
               <w:ind w:left="120"/>
             </w:pPr>
-            <w:hyperlink w:history="1" r:id="rId7oaq8jpdqgaqsm0vqnhhp">
+            <w:hyperlink w:history="1" r:id="rIdcp-1dc-cvqctbp79y7c0p">
               <w:r>
                 <w:rPr>
                   <w:rFonts w:ascii="Arial" w:cs="Arial" w:eastAsia="Arial" w:hAnsi="Arial"/>
@@ -13208,7 +13208,7 @@
             <w:pPr>
               <w:spacing w:after="20" w:before="0"/>
             </w:pPr>
-            <w:hyperlink w:history="1" r:id="rIdhuc5cj62c274d_d5rk5du">
+            <w:hyperlink w:history="1" r:id="rIdfpmi3gyy4vldvhyab17dm">
               <w:r>
                 <w:rPr>
                   <w:rFonts w:ascii="Arial" w:cs="Arial" w:eastAsia="Arial" w:hAnsi="Arial"/>
@@ -13241,7 +13241,7 @@
               <w:spacing w:after="10" w:before="0"/>
               <w:ind w:left="120"/>
             </w:pPr>
-            <w:hyperlink w:history="1" r:id="rIdfaryoqhqvlihxfbqqfcht">
+            <w:hyperlink w:history="1" r:id="rId39jbe0mlvsypd3cu0ndsu">
               <w:r>
                 <w:rPr>
                   <w:rFonts w:ascii="Arial" w:cs="Arial" w:eastAsia="Arial" w:hAnsi="Arial"/>
@@ -14728,7 +14728,7 @@
             <w:pPr>
               <w:spacing w:after="20" w:before="0"/>
             </w:pPr>
-            <w:hyperlink w:history="1" r:id="rIdjcgq24qrtbjdl4u-tt_zf">
+            <w:hyperlink w:history="1" r:id="rIdtekqdfxzvr3r_4hnbqhhp">
               <w:r>
                 <w:rPr>
                   <w:rFonts w:ascii="Arial" w:cs="Arial" w:eastAsia="Arial" w:hAnsi="Arial"/>
@@ -14761,7 +14761,7 @@
               <w:spacing w:after="10" w:before="0"/>
               <w:ind w:left="120"/>
             </w:pPr>
-            <w:hyperlink w:history="1" r:id="rIdplqfnn5je0vzobdxgazg4">
+            <w:hyperlink w:history="1" r:id="rIdkqfjxn3yt5k1m90w7leeg">
               <w:r>
                 <w:rPr>
                   <w:rFonts w:ascii="Arial" w:cs="Arial" w:eastAsia="Arial" w:hAnsi="Arial"/>
@@ -14806,7 +14806,7 @@
             <w:pPr>
               <w:spacing w:after="20" w:before="0"/>
             </w:pPr>
-            <w:hyperlink w:history="1" r:id="rIdwcvrqp2xqi8u2lmq2t53u">
+            <w:hyperlink w:history="1" r:id="rIds3fh7njuds1eq7gqisxrq">
               <w:r>
                 <w:rPr>
                   <w:rFonts w:ascii="Arial" w:cs="Arial" w:eastAsia="Arial" w:hAnsi="Arial"/>
@@ -14839,7 +14839,7 @@
               <w:spacing w:after="10" w:before="0"/>
               <w:ind w:left="120"/>
             </w:pPr>
-            <w:hyperlink w:history="1" r:id="rId1ilzhsh_9nkl9a78wivha">
+            <w:hyperlink w:history="1" r:id="rIdp38spr46padqhgrpxclwh">
               <w:r>
                 <w:rPr>
                   <w:rFonts w:ascii="Arial" w:cs="Arial" w:eastAsia="Arial" w:hAnsi="Arial"/>
@@ -15034,7 +15034,7 @@
             <w:pPr>
               <w:spacing w:after="20" w:before="0"/>
             </w:pPr>
-            <w:hyperlink w:history="1" r:id="rIdpivn92po8dl944gvozi16">
+            <w:hyperlink w:history="1" r:id="rIdkgbw9p4roaf8jpv36rzay">
               <w:r>
                 <w:rPr>
                   <w:rFonts w:ascii="Arial" w:cs="Arial" w:eastAsia="Arial" w:hAnsi="Arial"/>
@@ -15067,7 +15067,7 @@
               <w:spacing w:after="10" w:before="0"/>
               <w:ind w:left="120"/>
             </w:pPr>
-            <w:hyperlink w:history="1" r:id="rIdcfrafrr3bo8rd5itikkcp">
+            <w:hyperlink w:history="1" r:id="rIddcisgjmnvea9uuwbhoytc">
               <w:r>
                 <w:rPr>
                   <w:rFonts w:ascii="Arial" w:cs="Arial" w:eastAsia="Arial" w:hAnsi="Arial"/>
@@ -15112,7 +15112,7 @@
             <w:pPr>
               <w:spacing w:after="20" w:before="0"/>
             </w:pPr>
-            <w:hyperlink w:history="1" r:id="rIdrybhnrndsid0jydrt6ddc">
+            <w:hyperlink w:history="1" r:id="rIdtlbnxjulnbuax3pdptzr4">
               <w:r>
                 <w:rPr>
                   <w:rFonts w:ascii="Arial" w:cs="Arial" w:eastAsia="Arial" w:hAnsi="Arial"/>
@@ -15145,7 +15145,7 @@
               <w:spacing w:after="10" w:before="0"/>
               <w:ind w:left="120"/>
             </w:pPr>
-            <w:hyperlink w:history="1" r:id="rIdxhf50qci5jdxa6z-vi-mz">
+            <w:hyperlink w:history="1" r:id="rIdrv949oqzmylyjpvcb-woo">
               <w:r>
                 <w:rPr>
                   <w:rFonts w:ascii="Arial" w:cs="Arial" w:eastAsia="Arial" w:hAnsi="Arial"/>
@@ -15340,7 +15340,7 @@
             <w:pPr>
               <w:spacing w:after="20" w:before="0"/>
             </w:pPr>
-            <w:hyperlink w:history="1" r:id="rId5h-n0zekbv5jtoxjbzksu">
+            <w:hyperlink w:history="1" r:id="rIdt9cbq5p5xjhwdja2jlyhx">
               <w:r>
                 <w:rPr>
                   <w:rFonts w:ascii="Arial" w:cs="Arial" w:eastAsia="Arial" w:hAnsi="Arial"/>
@@ -15373,7 +15373,7 @@
               <w:spacing w:after="10" w:before="0"/>
               <w:ind w:left="120"/>
             </w:pPr>
-            <w:hyperlink w:history="1" r:id="rIdjlypsxk51ffmglxyweqao">
+            <w:hyperlink w:history="1" r:id="rId2nodiwh-qgmjbrk9ah6j8">
               <w:r>
                 <w:rPr>
                   <w:rFonts w:ascii="Arial" w:cs="Arial" w:eastAsia="Arial" w:hAnsi="Arial"/>
@@ -15418,7 +15418,7 @@
             <w:pPr>
               <w:spacing w:after="20" w:before="0"/>
             </w:pPr>
-            <w:hyperlink w:history="1" r:id="rIdhelookyo04hmjs1tunaj4">
+            <w:hyperlink w:history="1" r:id="rIdjshgawg9auqtmo2aqcw3a">
               <w:r>
                 <w:rPr>
                   <w:rFonts w:ascii="Arial" w:cs="Arial" w:eastAsia="Arial" w:hAnsi="Arial"/>
@@ -15451,7 +15451,7 @@
               <w:spacing w:after="10" w:before="0"/>
               <w:ind w:left="120"/>
             </w:pPr>
-            <w:hyperlink w:history="1" r:id="rId7nkxv0wlbsdpfkbsbrez5">
+            <w:hyperlink w:history="1" r:id="rIdeosxpk2rg6thma8oqciit">
               <w:r>
                 <w:rPr>
                   <w:rFonts w:ascii="Arial" w:cs="Arial" w:eastAsia="Arial" w:hAnsi="Arial"/>
@@ -15646,7 +15646,7 @@
             <w:pPr>
               <w:spacing w:after="20" w:before="0"/>
             </w:pPr>
-            <w:hyperlink w:history="1" r:id="rId4psgzewna2ikaqk6uk0x3">
+            <w:hyperlink w:history="1" r:id="rIdbiqwqvf23cbc0dvecwuib">
               <w:r>
                 <w:rPr>
                   <w:rFonts w:ascii="Arial" w:cs="Arial" w:eastAsia="Arial" w:hAnsi="Arial"/>
@@ -15679,7 +15679,7 @@
               <w:spacing w:after="10" w:before="0"/>
               <w:ind w:left="120"/>
             </w:pPr>
-            <w:hyperlink w:history="1" r:id="rIdji1s5hfyc3gx_hw5sqnn3">
+            <w:hyperlink w:history="1" r:id="rIdmam6bhppkgw5f2re0rfdh">
               <w:r>
                 <w:rPr>
                   <w:rFonts w:ascii="Arial" w:cs="Arial" w:eastAsia="Arial" w:hAnsi="Arial"/>
@@ -15724,7 +15724,7 @@
             <w:pPr>
               <w:spacing w:after="20" w:before="0"/>
             </w:pPr>
-            <w:hyperlink w:history="1" r:id="rId1axadxaezuz8m2x34htmu">
+            <w:hyperlink w:history="1" r:id="rIdrqupmocktvncrnpfnog1y">
               <w:r>
                 <w:rPr>
                   <w:rFonts w:ascii="Arial" w:cs="Arial" w:eastAsia="Arial" w:hAnsi="Arial"/>
@@ -15757,7 +15757,7 @@
               <w:spacing w:after="10" w:before="0"/>
               <w:ind w:left="120"/>
             </w:pPr>
-            <w:hyperlink w:history="1" r:id="rId-y06h9gcobnmlneml44gb">
+            <w:hyperlink w:history="1" r:id="rIdtiop_ljncdgj5qhaess87">
               <w:r>
                 <w:rPr>
                   <w:rFonts w:ascii="Arial" w:cs="Arial" w:eastAsia="Arial" w:hAnsi="Arial"/>
@@ -15952,7 +15952,7 @@
             <w:pPr>
               <w:spacing w:after="20" w:before="0"/>
             </w:pPr>
-            <w:hyperlink w:history="1" r:id="rIdigdh55peh6qv6h9trvwun">
+            <w:hyperlink w:history="1" r:id="rIdtoiv581jvpwa5qvjamdii">
               <w:r>
                 <w:rPr>
                   <w:rFonts w:ascii="Arial" w:cs="Arial" w:eastAsia="Arial" w:hAnsi="Arial"/>
@@ -15985,7 +15985,7 @@
               <w:spacing w:after="10" w:before="0"/>
               <w:ind w:left="120"/>
             </w:pPr>
-            <w:hyperlink w:history="1" r:id="rId2kohchjb16qgz0xeorz65">
+            <w:hyperlink w:history="1" r:id="rIdfabp6ggw-abyzddqq3_n4">
               <w:r>
                 <w:rPr>
                   <w:rFonts w:ascii="Arial" w:cs="Arial" w:eastAsia="Arial" w:hAnsi="Arial"/>
@@ -16030,7 +16030,7 @@
             <w:pPr>
               <w:spacing w:after="20" w:before="0"/>
             </w:pPr>
-            <w:hyperlink w:history="1" r:id="rIddxrbduilmftdzdln7h5ko">
+            <w:hyperlink w:history="1" r:id="rIdo0inlozipdzoepuvghaaz">
               <w:r>
                 <w:rPr>
                   <w:rFonts w:ascii="Arial" w:cs="Arial" w:eastAsia="Arial" w:hAnsi="Arial"/>
@@ -16063,7 +16063,7 @@
               <w:spacing w:after="10" w:before="0"/>
               <w:ind w:left="120"/>
             </w:pPr>
-            <w:hyperlink w:history="1" r:id="rIdlpwxwwneohlx9jd1iswq7">
+            <w:hyperlink w:history="1" r:id="rIdcg8fn42hc8rkupi4emay1">
               <w:r>
                 <w:rPr>
                   <w:rFonts w:ascii="Arial" w:cs="Arial" w:eastAsia="Arial" w:hAnsi="Arial"/>
@@ -17664,7 +17664,7 @@
             <w:pPr>
               <w:spacing w:after="20" w:before="0"/>
             </w:pPr>
-            <w:hyperlink w:history="1" r:id="rIdouvpgxdumbrbcdmmgyonl">
+            <w:hyperlink w:history="1" r:id="rIdpbujgdxhgenmoo9wu627d">
               <w:r>
                 <w:rPr>
                   <w:rFonts w:ascii="Arial" w:cs="Arial" w:eastAsia="Arial" w:hAnsi="Arial"/>
@@ -17697,7 +17697,7 @@
               <w:spacing w:after="10" w:before="0"/>
               <w:ind w:left="120"/>
             </w:pPr>
-            <w:hyperlink w:history="1" r:id="rIdp6cbaaurbqj41wktdiq_y">
+            <w:hyperlink w:history="1" r:id="rIdq87qwzykmt6uuv3gbcc9q">
               <w:r>
                 <w:rPr>
                   <w:rFonts w:ascii="Arial" w:cs="Arial" w:eastAsia="Arial" w:hAnsi="Arial"/>
@@ -17742,7 +17742,7 @@
             <w:pPr>
               <w:spacing w:after="20" w:before="0"/>
             </w:pPr>
-            <w:hyperlink w:history="1" r:id="rIdw885sn8vig8exjsdfjz5f">
+            <w:hyperlink w:history="1" r:id="rId4kkmjhdzeccr5fcigo0m_">
               <w:r>
                 <w:rPr>
                   <w:rFonts w:ascii="Arial" w:cs="Arial" w:eastAsia="Arial" w:hAnsi="Arial"/>
@@ -17775,7 +17775,7 @@
               <w:spacing w:after="10" w:before="0"/>
               <w:ind w:left="120"/>
             </w:pPr>
-            <w:hyperlink w:history="1" r:id="rId8lk2pebuvgnuh6xnnnwen">
+            <w:hyperlink w:history="1" r:id="rIdhqlnxjlb_wfkbg5mhaia2">
               <w:r>
                 <w:rPr>
                   <w:rFonts w:ascii="Arial" w:cs="Arial" w:eastAsia="Arial" w:hAnsi="Arial"/>
@@ -17970,7 +17970,7 @@
             <w:pPr>
               <w:spacing w:after="20" w:before="0"/>
             </w:pPr>
-            <w:hyperlink w:history="1" r:id="rIdkl-7m43__-wj186b5fjr8">
+            <w:hyperlink w:history="1" r:id="rId_iqy_gdvl3terhhq2kgaj">
               <w:r>
                 <w:rPr>
                   <w:rFonts w:ascii="Arial" w:cs="Arial" w:eastAsia="Arial" w:hAnsi="Arial"/>
@@ -18003,7 +18003,7 @@
               <w:spacing w:after="10" w:before="0"/>
               <w:ind w:left="120"/>
             </w:pPr>
-            <w:hyperlink w:history="1" r:id="rIdq8j39qz4290syrob6-1sg">
+            <w:hyperlink w:history="1" r:id="rIdua5teleqf4a1opt9w8t-q">
               <w:r>
                 <w:rPr>
                   <w:rFonts w:ascii="Arial" w:cs="Arial" w:eastAsia="Arial" w:hAnsi="Arial"/>
@@ -18048,7 +18048,7 @@
             <w:pPr>
               <w:spacing w:after="20" w:before="0"/>
             </w:pPr>
-            <w:hyperlink w:history="1" r:id="rIdds9vtrvbpxk-0wjcesg2h">
+            <w:hyperlink w:history="1" r:id="rIdjjbycttcrg5hoh-fsnxli">
               <w:r>
                 <w:rPr>
                   <w:rFonts w:ascii="Arial" w:cs="Arial" w:eastAsia="Arial" w:hAnsi="Arial"/>
@@ -18081,7 +18081,7 @@
               <w:spacing w:after="10" w:before="0"/>
               <w:ind w:left="120"/>
             </w:pPr>
-            <w:hyperlink w:history="1" r:id="rIdevy3nr8vqlelt9omghv8n">
+            <w:hyperlink w:history="1" r:id="rIdvinieeeo7ozqkqvpb2uyd">
               <w:r>
                 <w:rPr>
                   <w:rFonts w:ascii="Arial" w:cs="Arial" w:eastAsia="Arial" w:hAnsi="Arial"/>
@@ -18276,7 +18276,7 @@
             <w:pPr>
               <w:spacing w:after="20" w:before="0"/>
             </w:pPr>
-            <w:hyperlink w:history="1" r:id="rIdzsyvsorkn0ktroxba6uqe">
+            <w:hyperlink w:history="1" r:id="rId3l5maczbn14xkrydkojgr">
               <w:r>
                 <w:rPr>
                   <w:rFonts w:ascii="Arial" w:cs="Arial" w:eastAsia="Arial" w:hAnsi="Arial"/>
@@ -18309,7 +18309,7 @@
               <w:spacing w:after="10" w:before="0"/>
               <w:ind w:left="120"/>
             </w:pPr>
-            <w:hyperlink w:history="1" r:id="rId8nrjko7-perawo84124mg">
+            <w:hyperlink w:history="1" r:id="rIdm-05c6qmcj8rigattgtw7">
               <w:r>
                 <w:rPr>
                   <w:rFonts w:ascii="Arial" w:cs="Arial" w:eastAsia="Arial" w:hAnsi="Arial"/>
@@ -18354,7 +18354,7 @@
             <w:pPr>
               <w:spacing w:after="20" w:before="0"/>
             </w:pPr>
-            <w:hyperlink w:history="1" r:id="rIdm0hwijl32pxlj8n-yskkn">
+            <w:hyperlink w:history="1" r:id="rIdd3lomgqo6oodne5bwcrjh">
               <w:r>
                 <w:rPr>
                   <w:rFonts w:ascii="Arial" w:cs="Arial" w:eastAsia="Arial" w:hAnsi="Arial"/>
@@ -18387,7 +18387,7 @@
               <w:spacing w:after="10" w:before="0"/>
               <w:ind w:left="120"/>
             </w:pPr>
-            <w:hyperlink w:history="1" r:id="rIdbkjgyuvlbtgxts-znac8k">
+            <w:hyperlink w:history="1" r:id="rIddeqt_m4zlibf436vajt49">
               <w:r>
                 <w:rPr>
                   <w:rFonts w:ascii="Arial" w:cs="Arial" w:eastAsia="Arial" w:hAnsi="Arial"/>
@@ -18582,7 +18582,7 @@
             <w:pPr>
               <w:spacing w:after="20" w:before="0"/>
             </w:pPr>
-            <w:hyperlink w:history="1" r:id="rIdcyycxjwn_qutnmb2xc86q">
+            <w:hyperlink w:history="1" r:id="rIdkiasyyvercpfybgcvttv9">
               <w:r>
                 <w:rPr>
                   <w:rFonts w:ascii="Arial" w:cs="Arial" w:eastAsia="Arial" w:hAnsi="Arial"/>
@@ -18615,7 +18615,7 @@
               <w:spacing w:after="10" w:before="0"/>
               <w:ind w:left="120"/>
             </w:pPr>
-            <w:hyperlink w:history="1" r:id="rIdknpkl8ovxymgzgh5rofbx">
+            <w:hyperlink w:history="1" r:id="rIdq4vmprvl-wk9zy1be7m7p">
               <w:r>
                 <w:rPr>
                   <w:rFonts w:ascii="Arial" w:cs="Arial" w:eastAsia="Arial" w:hAnsi="Arial"/>
@@ -18660,7 +18660,7 @@
             <w:pPr>
               <w:spacing w:after="20" w:before="0"/>
             </w:pPr>
-            <w:hyperlink w:history="1" r:id="rIdqcvdsh0ad2kaituxilbcl">
+            <w:hyperlink w:history="1" r:id="rIdghbcgoikawggeqppq-ckl">
               <w:r>
                 <w:rPr>
                   <w:rFonts w:ascii="Arial" w:cs="Arial" w:eastAsia="Arial" w:hAnsi="Arial"/>
@@ -18693,7 +18693,7 @@
               <w:spacing w:after="10" w:before="0"/>
               <w:ind w:left="120"/>
             </w:pPr>
-            <w:hyperlink w:history="1" r:id="rId7xjehh062wzggygfzb5df">
+            <w:hyperlink w:history="1" r:id="rIdr6beuqduk-j_mqd-55_nf">
               <w:r>
                 <w:rPr>
                   <w:rFonts w:ascii="Arial" w:cs="Arial" w:eastAsia="Arial" w:hAnsi="Arial"/>
@@ -18888,7 +18888,7 @@
             <w:pPr>
               <w:spacing w:after="20" w:before="0"/>
             </w:pPr>
-            <w:hyperlink w:history="1" r:id="rId6ei48otwlhgcniiippkru">
+            <w:hyperlink w:history="1" r:id="rIdkfvb8e0rbkzqvctjz7upi">
               <w:r>
                 <w:rPr>
                   <w:rFonts w:ascii="Arial" w:cs="Arial" w:eastAsia="Arial" w:hAnsi="Arial"/>
@@ -18921,7 +18921,7 @@
               <w:spacing w:after="10" w:before="0"/>
               <w:ind w:left="120"/>
             </w:pPr>
-            <w:hyperlink w:history="1" r:id="rIdepksifppactforv8glu8u">
+            <w:hyperlink w:history="1" r:id="rIdfym1k52yvaaqhpkevw-fz">
               <w:r>
                 <w:rPr>
                   <w:rFonts w:ascii="Arial" w:cs="Arial" w:eastAsia="Arial" w:hAnsi="Arial"/>
@@ -18966,7 +18966,7 @@
             <w:pPr>
               <w:spacing w:after="20" w:before="0"/>
             </w:pPr>
-            <w:hyperlink w:history="1" r:id="rId3vx9lhyhfvxscsjg-sqse">
+            <w:hyperlink w:history="1" r:id="rIdohiltt3ke0as6pe_1bzk5">
               <w:r>
                 <w:rPr>
                   <w:rFonts w:ascii="Arial" w:cs="Arial" w:eastAsia="Arial" w:hAnsi="Arial"/>
@@ -18999,7 +18999,7 @@
               <w:spacing w:after="10" w:before="0"/>
               <w:ind w:left="120"/>
             </w:pPr>
-            <w:hyperlink w:history="1" r:id="rId2f5lyuq65hq36md92kmna">
+            <w:hyperlink w:history="1" r:id="rIdljup2y-fol2ynjtvgu77t">
               <w:r>
                 <w:rPr>
                   <w:rFonts w:ascii="Arial" w:cs="Arial" w:eastAsia="Arial" w:hAnsi="Arial"/>
@@ -20487,7 +20487,7 @@
             <w:pPr>
               <w:spacing w:after="20" w:before="0"/>
             </w:pPr>
-            <w:hyperlink w:history="1" r:id="rIdhyv7nt3edad8tssd5igoy">
+            <w:hyperlink w:history="1" r:id="rIddmzwsuodiyqyx64n-nlbz">
               <w:r>
                 <w:rPr>
                   <w:rFonts w:ascii="Arial" w:cs="Arial" w:eastAsia="Arial" w:hAnsi="Arial"/>
@@ -20520,7 +20520,7 @@
               <w:spacing w:after="10" w:before="0"/>
               <w:ind w:left="120"/>
             </w:pPr>
-            <w:hyperlink w:history="1" r:id="rIdt5uu1fn9wlf2fkjhax7p1">
+            <w:hyperlink w:history="1" r:id="rIduekxsjzrpz6sliidzuhgs">
               <w:r>
                 <w:rPr>
                   <w:rFonts w:ascii="Arial" w:cs="Arial" w:eastAsia="Arial" w:hAnsi="Arial"/>
@@ -20565,7 +20565,7 @@
             <w:pPr>
               <w:spacing w:after="20" w:before="0"/>
             </w:pPr>
-            <w:hyperlink w:history="1" r:id="rIdomqnqhk8ep6mnd2rjtt0v">
+            <w:hyperlink w:history="1" r:id="rIdjxlj2vqdcqtcrrjutwbfh">
               <w:r>
                 <w:rPr>
                   <w:rFonts w:ascii="Arial" w:cs="Arial" w:eastAsia="Arial" w:hAnsi="Arial"/>
@@ -20598,7 +20598,7 @@
               <w:spacing w:after="10" w:before="0"/>
               <w:ind w:left="120"/>
             </w:pPr>
-            <w:hyperlink w:history="1" r:id="rIdnjyoofxlfkh0htqosbi-x">
+            <w:hyperlink w:history="1" r:id="rIda4v_jvkmvq2rhgvl7x--s">
               <w:r>
                 <w:rPr>
                   <w:rFonts w:ascii="Arial" w:cs="Arial" w:eastAsia="Arial" w:hAnsi="Arial"/>
@@ -20869,7 +20869,7 @@
             <w:pPr>
               <w:spacing w:after="20" w:before="0"/>
             </w:pPr>
-            <w:hyperlink w:history="1" r:id="rIdhq73h6l_tgtsehbsc0lua">
+            <w:hyperlink w:history="1" r:id="rIdaawxwe425qfkdkxsalza3">
               <w:r>
                 <w:rPr>
                   <w:rFonts w:ascii="Arial" w:cs="Arial" w:eastAsia="Arial" w:hAnsi="Arial"/>
@@ -20902,7 +20902,7 @@
               <w:spacing w:after="10" w:before="0"/>
               <w:ind w:left="120"/>
             </w:pPr>
-            <w:hyperlink w:history="1" r:id="rIdf5iidunf12erpaciwoedb">
+            <w:hyperlink w:history="1" r:id="rId1ks-iol2luaw2fph96gtx">
               <w:r>
                 <w:rPr>
                   <w:rFonts w:ascii="Arial" w:cs="Arial" w:eastAsia="Arial" w:hAnsi="Arial"/>
@@ -20947,7 +20947,7 @@
             <w:pPr>
               <w:spacing w:after="20" w:before="0"/>
             </w:pPr>
-            <w:hyperlink w:history="1" r:id="rIdugjqf9nr3lk0wjypsga-p">
+            <w:hyperlink w:history="1" r:id="rId7ia1i-dxllwqiberwr5z5">
               <w:r>
                 <w:rPr>
                   <w:rFonts w:ascii="Arial" w:cs="Arial" w:eastAsia="Arial" w:hAnsi="Arial"/>
@@ -20980,7 +20980,7 @@
               <w:spacing w:after="10" w:before="0"/>
               <w:ind w:left="120"/>
             </w:pPr>
-            <w:hyperlink w:history="1" r:id="rIdy1oqo-oixjlvdt1yhb-t4">
+            <w:hyperlink w:history="1" r:id="rIdow_ms7oeekrffbm3igs82">
               <w:r>
                 <w:rPr>
                   <w:rFonts w:ascii="Arial" w:cs="Arial" w:eastAsia="Arial" w:hAnsi="Arial"/>
@@ -21479,7 +21479,7 @@
             <w:pPr>
               <w:spacing w:after="20" w:before="0"/>
             </w:pPr>
-            <w:hyperlink w:history="1" r:id="rIdcngjrpqxerttcpfm1xjq0">
+            <w:hyperlink w:history="1" r:id="rIdd8qatm9bm8b94jv24n4nb">
               <w:r>
                 <w:rPr>
                   <w:rFonts w:ascii="Arial" w:cs="Arial" w:eastAsia="Arial" w:hAnsi="Arial"/>
@@ -21512,7 +21512,7 @@
               <w:spacing w:after="10" w:before="0"/>
               <w:ind w:left="120"/>
             </w:pPr>
-            <w:hyperlink w:history="1" r:id="rIdopcrnlrlq7iwsynqxjdds">
+            <w:hyperlink w:history="1" r:id="rId4m11gj79r2rgfmyeaammp">
               <w:r>
                 <w:rPr>
                   <w:rFonts w:ascii="Arial" w:cs="Arial" w:eastAsia="Arial" w:hAnsi="Arial"/>
@@ -21557,7 +21557,7 @@
             <w:pPr>
               <w:spacing w:after="20" w:before="0"/>
             </w:pPr>
-            <w:hyperlink w:history="1" r:id="rIdb_a5sj3yqlzppfgxowa77">
+            <w:hyperlink w:history="1" r:id="rIdhiiosbp1myjk6pyyiwvnj">
               <w:r>
                 <w:rPr>
                   <w:rFonts w:ascii="Arial" w:cs="Arial" w:eastAsia="Arial" w:hAnsi="Arial"/>
@@ -21590,7 +21590,7 @@
               <w:spacing w:after="10" w:before="0"/>
               <w:ind w:left="120"/>
             </w:pPr>
-            <w:hyperlink w:history="1" r:id="rIdf2cwvuh3agfsae3lnadyo">
+            <w:hyperlink w:history="1" r:id="rIdytdvpdvleujj1zxlfeh10">
               <w:r>
                 <w:rPr>
                   <w:rFonts w:ascii="Arial" w:cs="Arial" w:eastAsia="Arial" w:hAnsi="Arial"/>
@@ -21861,7 +21861,7 @@
             <w:pPr>
               <w:spacing w:after="20" w:before="0"/>
             </w:pPr>
-            <w:hyperlink w:history="1" r:id="rId2iuciq9xjpo6qzhqenou1">
+            <w:hyperlink w:history="1" r:id="rIdoujvcci67eygyzlwtwbla">
               <w:r>
                 <w:rPr>
                   <w:rFonts w:ascii="Arial" w:cs="Arial" w:eastAsia="Arial" w:hAnsi="Arial"/>
@@ -21894,7 +21894,7 @@
               <w:spacing w:after="10" w:before="0"/>
               <w:ind w:left="120"/>
             </w:pPr>
-            <w:hyperlink w:history="1" r:id="rIdsi7mgtlwwjnur438q24ye">
+            <w:hyperlink w:history="1" r:id="rIdntzluqv2apm-qoxlljlk2">
               <w:r>
                 <w:rPr>
                   <w:rFonts w:ascii="Arial" w:cs="Arial" w:eastAsia="Arial" w:hAnsi="Arial"/>
@@ -21939,7 +21939,7 @@
             <w:pPr>
               <w:spacing w:after="20" w:before="0"/>
             </w:pPr>
-            <w:hyperlink w:history="1" r:id="rIdjggucfudrlfk-myt5ik1c">
+            <w:hyperlink w:history="1" r:id="rIdxrp6hgb4hhdviyfneqxor">
               <w:r>
                 <w:rPr>
                   <w:rFonts w:ascii="Arial" w:cs="Arial" w:eastAsia="Arial" w:hAnsi="Arial"/>
@@ -21972,7 +21972,7 @@
               <w:spacing w:after="10" w:before="0"/>
               <w:ind w:left="120"/>
             </w:pPr>
-            <w:hyperlink w:history="1" r:id="rId9n89r2eg6msca1zqygagr">
+            <w:hyperlink w:history="1" r:id="rId-duvml4_xf51segbsypzg">
               <w:r>
                 <w:rPr>
                   <w:rFonts w:ascii="Arial" w:cs="Arial" w:eastAsia="Arial" w:hAnsi="Arial"/>
@@ -22243,7 +22243,7 @@
             <w:pPr>
               <w:spacing w:after="20" w:before="0"/>
             </w:pPr>
-            <w:hyperlink w:history="1" r:id="rIdtytzegdy5fg7eprze1yh2">
+            <w:hyperlink w:history="1" r:id="rIdymipdojoekyukdyxb0hd7">
               <w:r>
                 <w:rPr>
                   <w:rFonts w:ascii="Arial" w:cs="Arial" w:eastAsia="Arial" w:hAnsi="Arial"/>
@@ -22276,7 +22276,7 @@
               <w:spacing w:after="10" w:before="0"/>
               <w:ind w:left="120"/>
             </w:pPr>
-            <w:hyperlink w:history="1" r:id="rId8xzmqbnrawobx3zvpqswm">
+            <w:hyperlink w:history="1" r:id="rIdexapcbcc7tl6fdebrtf3n">
               <w:r>
                 <w:rPr>
                   <w:rFonts w:ascii="Arial" w:cs="Arial" w:eastAsia="Arial" w:hAnsi="Arial"/>
@@ -22321,7 +22321,7 @@
             <w:pPr>
               <w:spacing w:after="20" w:before="0"/>
             </w:pPr>
-            <w:hyperlink w:history="1" r:id="rId1qir1sjumezamxjs4gh3u">
+            <w:hyperlink w:history="1" r:id="rIdrprgu4olbxxfgvqwayvz2">
               <w:r>
                 <w:rPr>
                   <w:rFonts w:ascii="Arial" w:cs="Arial" w:eastAsia="Arial" w:hAnsi="Arial"/>
@@ -22354,7 +22354,7 @@
               <w:spacing w:after="10" w:before="0"/>
               <w:ind w:left="120"/>
             </w:pPr>
-            <w:hyperlink w:history="1" r:id="rId7j_c9hm0f9fs229vpxlzn">
+            <w:hyperlink w:history="1" r:id="rIdmsugakx1spn0fklky_e81">
               <w:r>
                 <w:rPr>
                   <w:rFonts w:ascii="Arial" w:cs="Arial" w:eastAsia="Arial" w:hAnsi="Arial"/>
@@ -23955,7 +23955,7 @@
             <w:pPr>
               <w:spacing w:after="20" w:before="0"/>
             </w:pPr>
-            <w:hyperlink w:history="1" r:id="rIdnzgqzrlvfr_m7eofgpnyq">
+            <w:hyperlink w:history="1" r:id="rIdmaw6vvlik5tvul9nof2-e">
               <w:r>
                 <w:rPr>
                   <w:rFonts w:ascii="Arial" w:cs="Arial" w:eastAsia="Arial" w:hAnsi="Arial"/>
@@ -23988,7 +23988,7 @@
               <w:spacing w:after="10" w:before="0"/>
               <w:ind w:left="120"/>
             </w:pPr>
-            <w:hyperlink w:history="1" r:id="rIdbdzrjd3_ydybkiuilgwlm">
+            <w:hyperlink w:history="1" r:id="rIdxi_ojjigmutzsk8gr2fz8">
               <w:r>
                 <w:rPr>
                   <w:rFonts w:ascii="Arial" w:cs="Arial" w:eastAsia="Arial" w:hAnsi="Arial"/>
@@ -24033,7 +24033,7 @@
             <w:pPr>
               <w:spacing w:after="20" w:before="0"/>
             </w:pPr>
-            <w:hyperlink w:history="1" r:id="rId2lihheur4trub4xdpjd-b">
+            <w:hyperlink w:history="1" r:id="rIdqns_u1wpgwdcdrevnlxzk">
               <w:r>
                 <w:rPr>
                   <w:rFonts w:ascii="Arial" w:cs="Arial" w:eastAsia="Arial" w:hAnsi="Arial"/>
@@ -24066,7 +24066,7 @@
               <w:spacing w:after="10" w:before="0"/>
               <w:ind w:left="120"/>
             </w:pPr>
-            <w:hyperlink w:history="1" r:id="rIdxio8lqfdfuird6nwzqhde">
+            <w:hyperlink w:history="1" r:id="rIdr_0qjsrew_pn9esrcilu7">
               <w:r>
                 <w:rPr>
                   <w:rFonts w:ascii="Arial" w:cs="Arial" w:eastAsia="Arial" w:hAnsi="Arial"/>
@@ -24261,7 +24261,7 @@
             <w:pPr>
               <w:spacing w:after="20" w:before="0"/>
             </w:pPr>
-            <w:hyperlink w:history="1" r:id="rIdws_myujwyrxhqfcvgsn1m">
+            <w:hyperlink w:history="1" r:id="rIdbylejghwdv7wuciaynrra">
               <w:r>
                 <w:rPr>
                   <w:rFonts w:ascii="Arial" w:cs="Arial" w:eastAsia="Arial" w:hAnsi="Arial"/>
@@ -24294,7 +24294,7 @@
               <w:spacing w:after="10" w:before="0"/>
               <w:ind w:left="120"/>
             </w:pPr>
-            <w:hyperlink w:history="1" r:id="rIdvcs0j6ujheexwe-hmk387">
+            <w:hyperlink w:history="1" r:id="rIdeafxn031_0d90ixft2kfj">
               <w:r>
                 <w:rPr>
                   <w:rFonts w:ascii="Arial" w:cs="Arial" w:eastAsia="Arial" w:hAnsi="Arial"/>
@@ -24339,7 +24339,7 @@
             <w:pPr>
               <w:spacing w:after="20" w:before="0"/>
             </w:pPr>
-            <w:hyperlink w:history="1" r:id="rIdrbn0a0f9weyqdbaarpdkp">
+            <w:hyperlink w:history="1" r:id="rIdczyrv3df2akapzujb4qbt">
               <w:r>
                 <w:rPr>
                   <w:rFonts w:ascii="Arial" w:cs="Arial" w:eastAsia="Arial" w:hAnsi="Arial"/>
@@ -24372,7 +24372,7 @@
               <w:spacing w:after="10" w:before="0"/>
               <w:ind w:left="120"/>
             </w:pPr>
-            <w:hyperlink w:history="1" r:id="rIdvblmwaxbat4c0nmarehh0">
+            <w:hyperlink w:history="1" r:id="rId1bsvj7hre9ltr0strtllq">
               <w:r>
                 <w:rPr>
                   <w:rFonts w:ascii="Arial" w:cs="Arial" w:eastAsia="Arial" w:hAnsi="Arial"/>
@@ -24567,7 +24567,7 @@
             <w:pPr>
               <w:spacing w:after="20" w:before="0"/>
             </w:pPr>
-            <w:hyperlink w:history="1" r:id="rIdtm9iexmpzyy5px5flr-aw">
+            <w:hyperlink w:history="1" r:id="rIdmm8p8s9pu-pepy4r3lbrz">
               <w:r>
                 <w:rPr>
                   <w:rFonts w:ascii="Arial" w:cs="Arial" w:eastAsia="Arial" w:hAnsi="Arial"/>
@@ -24600,7 +24600,7 @@
               <w:spacing w:after="10" w:before="0"/>
               <w:ind w:left="120"/>
             </w:pPr>
-            <w:hyperlink w:history="1" r:id="rId4jcxlyfrezjsv3pmyujwi">
+            <w:hyperlink w:history="1" r:id="rIdix4b4x7wbstwudl9kjox4">
               <w:r>
                 <w:rPr>
                   <w:rFonts w:ascii="Arial" w:cs="Arial" w:eastAsia="Arial" w:hAnsi="Arial"/>
@@ -24645,7 +24645,7 @@
             <w:pPr>
               <w:spacing w:after="20" w:before="0"/>
             </w:pPr>
-            <w:hyperlink w:history="1" r:id="rIdxjnedrt5jdbq-8nsoyxt4">
+            <w:hyperlink w:history="1" r:id="rIdpfpobiyzrujiwzadix_cc">
               <w:r>
                 <w:rPr>
                   <w:rFonts w:ascii="Arial" w:cs="Arial" w:eastAsia="Arial" w:hAnsi="Arial"/>
@@ -24678,7 +24678,7 @@
               <w:spacing w:after="10" w:before="0"/>
               <w:ind w:left="120"/>
             </w:pPr>
-            <w:hyperlink w:history="1" r:id="rIdj0tvbpiz4swfd0x5qptyn">
+            <w:hyperlink w:history="1" r:id="rId4cswngbiflyrm_6zp5u5x">
               <w:r>
                 <w:rPr>
                   <w:rFonts w:ascii="Arial" w:cs="Arial" w:eastAsia="Arial" w:hAnsi="Arial"/>
@@ -24873,7 +24873,7 @@
             <w:pPr>
               <w:spacing w:after="20" w:before="0"/>
             </w:pPr>
-            <w:hyperlink w:history="1" r:id="rId7-gr-hkiawitywqdrktwy">
+            <w:hyperlink w:history="1" r:id="rIddpwqroq-cu7nrb2dtuos2">
               <w:r>
                 <w:rPr>
                   <w:rFonts w:ascii="Arial" w:cs="Arial" w:eastAsia="Arial" w:hAnsi="Arial"/>
@@ -24906,7 +24906,7 @@
               <w:spacing w:after="10" w:before="0"/>
               <w:ind w:left="120"/>
             </w:pPr>
-            <w:hyperlink w:history="1" r:id="rId1mequacjtseaqju6opjor">
+            <w:hyperlink w:history="1" r:id="rIdqdayimuzvmh9rptqjhc_b">
               <w:r>
                 <w:rPr>
                   <w:rFonts w:ascii="Arial" w:cs="Arial" w:eastAsia="Arial" w:hAnsi="Arial"/>
@@ -24951,7 +24951,7 @@
             <w:pPr>
               <w:spacing w:after="20" w:before="0"/>
             </w:pPr>
-            <w:hyperlink w:history="1" r:id="rIds0rounenx7q4nhr7hpach">
+            <w:hyperlink w:history="1" r:id="rIdqdmjcyifhsnt1jjmvnxgs">
               <w:r>
                 <w:rPr>
                   <w:rFonts w:ascii="Arial" w:cs="Arial" w:eastAsia="Arial" w:hAnsi="Arial"/>
@@ -24984,7 +24984,7 @@
               <w:spacing w:after="10" w:before="0"/>
               <w:ind w:left="120"/>
             </w:pPr>
-            <w:hyperlink w:history="1" r:id="rIdk4vggxggpc3vbwfxf2jrh">
+            <w:hyperlink w:history="1" r:id="rIdiahjj3ia16vrrdtkeqba4">
               <w:r>
                 <w:rPr>
                   <w:rFonts w:ascii="Arial" w:cs="Arial" w:eastAsia="Arial" w:hAnsi="Arial"/>
@@ -25179,7 +25179,7 @@
             <w:pPr>
               <w:spacing w:after="20" w:before="0"/>
             </w:pPr>
-            <w:hyperlink w:history="1" r:id="rIdzxd4gxyuatoil_l9yod5-">
+            <w:hyperlink w:history="1" r:id="rIdgzr1txm33nyr4bo9ooytv">
               <w:r>
                 <w:rPr>
                   <w:rFonts w:ascii="Arial" w:cs="Arial" w:eastAsia="Arial" w:hAnsi="Arial"/>
@@ -25212,7 +25212,7 @@
               <w:spacing w:after="10" w:before="0"/>
               <w:ind w:left="120"/>
             </w:pPr>
-            <w:hyperlink w:history="1" r:id="rIdlfl2z4hgilct1iq1wvjuw">
+            <w:hyperlink w:history="1" r:id="rIdj74tmqp347ji2mu6luii6">
               <w:r>
                 <w:rPr>
                   <w:rFonts w:ascii="Arial" w:cs="Arial" w:eastAsia="Arial" w:hAnsi="Arial"/>
@@ -25257,7 +25257,7 @@
             <w:pPr>
               <w:spacing w:after="20" w:before="0"/>
             </w:pPr>
-            <w:hyperlink w:history="1" r:id="rIdj6qwkc9tpke6lmtab4akq">
+            <w:hyperlink w:history="1" r:id="rIdqbnoo84ufj1ln30u0mtdc">
               <w:r>
                 <w:rPr>
                   <w:rFonts w:ascii="Arial" w:cs="Arial" w:eastAsia="Arial" w:hAnsi="Arial"/>
@@ -25290,7 +25290,7 @@
               <w:spacing w:after="10" w:before="0"/>
               <w:ind w:left="120"/>
             </w:pPr>
-            <w:hyperlink w:history="1" r:id="rIdzvvyjmac0b5x1bfvpavxi">
+            <w:hyperlink w:history="1" r:id="rIdswlq8idhn4p40fdk9dd6y">
               <w:r>
                 <w:rPr>
                   <w:rFonts w:ascii="Arial" w:cs="Arial" w:eastAsia="Arial" w:hAnsi="Arial"/>
@@ -26777,7 +26777,7 @@
             <w:pPr>
               <w:spacing w:after="20" w:before="0"/>
             </w:pPr>
-            <w:hyperlink w:history="1" r:id="rIduqzjz1vqzm-y9v-o9ix74">
+            <w:hyperlink w:history="1" r:id="rIdt40qe63rvaqvimh7bzfhe">
               <w:r>
                 <w:rPr>
                   <w:rFonts w:ascii="Arial" w:cs="Arial" w:eastAsia="Arial" w:hAnsi="Arial"/>
@@ -26810,7 +26810,7 @@
               <w:spacing w:after="10" w:before="0"/>
               <w:ind w:left="120"/>
             </w:pPr>
-            <w:hyperlink w:history="1" r:id="rIdsf00byld-xtymn3vsmlsj">
+            <w:hyperlink w:history="1" r:id="rIdy0ldaejtb-_uqsie2_xoi">
               <w:r>
                 <w:rPr>
                   <w:rFonts w:ascii="Arial" w:cs="Arial" w:eastAsia="Arial" w:hAnsi="Arial"/>
@@ -26855,7 +26855,7 @@
             <w:pPr>
               <w:spacing w:after="20" w:before="0"/>
             </w:pPr>
-            <w:hyperlink w:history="1" r:id="rIdwiqjvbuiry3zvejbdsbjb">
+            <w:hyperlink w:history="1" r:id="rId_to2s7vssekr-qcbxgtvr">
               <w:r>
                 <w:rPr>
                   <w:rFonts w:ascii="Arial" w:cs="Arial" w:eastAsia="Arial" w:hAnsi="Arial"/>
@@ -26888,7 +26888,7 @@
               <w:spacing w:after="10" w:before="0"/>
               <w:ind w:left="120"/>
             </w:pPr>
-            <w:hyperlink w:history="1" r:id="rIdp1jctraeenrv4ogwgiqh9">
+            <w:hyperlink w:history="1" r:id="rIdnxxsaexcr4d-b0nz-eoz7">
               <w:r>
                 <w:rPr>
                   <w:rFonts w:ascii="Arial" w:cs="Arial" w:eastAsia="Arial" w:hAnsi="Arial"/>
@@ -27083,7 +27083,7 @@
             <w:pPr>
               <w:spacing w:after="20" w:before="0"/>
             </w:pPr>
-            <w:hyperlink w:history="1" r:id="rIdzxib1nnlyos5bighofoev">
+            <w:hyperlink w:history="1" r:id="rIdqyl9qxda4elxawysx1k2j">
               <w:r>
                 <w:rPr>
                   <w:rFonts w:ascii="Arial" w:cs="Arial" w:eastAsia="Arial" w:hAnsi="Arial"/>
@@ -27116,7 +27116,7 @@
               <w:spacing w:after="10" w:before="0"/>
               <w:ind w:left="120"/>
             </w:pPr>
-            <w:hyperlink w:history="1" r:id="rId_azxx5ognbdjvfjwi5abi">
+            <w:hyperlink w:history="1" r:id="rIdchct2mkclou9yh1_nydxj">
               <w:r>
                 <w:rPr>
                   <w:rFonts w:ascii="Arial" w:cs="Arial" w:eastAsia="Arial" w:hAnsi="Arial"/>
@@ -27161,7 +27161,7 @@
             <w:pPr>
               <w:spacing w:after="20" w:before="0"/>
             </w:pPr>
-            <w:hyperlink w:history="1" r:id="rIdnv0tlr5s8g4dpfao87beo">
+            <w:hyperlink w:history="1" r:id="rIdzb-tfb_dsrs2gj3vspasu">
               <w:r>
                 <w:rPr>
                   <w:rFonts w:ascii="Arial" w:cs="Arial" w:eastAsia="Arial" w:hAnsi="Arial"/>
@@ -27194,7 +27194,7 @@
               <w:spacing w:after="10" w:before="0"/>
               <w:ind w:left="120"/>
             </w:pPr>
-            <w:hyperlink w:history="1" r:id="rIdeo0sgg_xm9mykynbfsxih">
+            <w:hyperlink w:history="1" r:id="rIdmou2dyfiuy4qpbza3plqb">
               <w:r>
                 <w:rPr>
                   <w:rFonts w:ascii="Arial" w:cs="Arial" w:eastAsia="Arial" w:hAnsi="Arial"/>
@@ -27389,7 +27389,7 @@
             <w:pPr>
               <w:spacing w:after="20" w:before="0"/>
             </w:pPr>
-            <w:hyperlink w:history="1" r:id="rIdwxfiwuwrrma4v2jlxynxn">
+            <w:hyperlink w:history="1" r:id="rIdorv-31wwcw2anlz7t_jwk">
               <w:r>
                 <w:rPr>
                   <w:rFonts w:ascii="Arial" w:cs="Arial" w:eastAsia="Arial" w:hAnsi="Arial"/>
@@ -27422,7 +27422,7 @@
               <w:spacing w:after="10" w:before="0"/>
               <w:ind w:left="120"/>
             </w:pPr>
-            <w:hyperlink w:history="1" r:id="rIdwgr4l7mcgoelbvrnv8hne">
+            <w:hyperlink w:history="1" r:id="rIdgrh5lsotfp92beryp8tio">
               <w:r>
                 <w:rPr>
                   <w:rFonts w:ascii="Arial" w:cs="Arial" w:eastAsia="Arial" w:hAnsi="Arial"/>
@@ -27467,7 +27467,7 @@
             <w:pPr>
               <w:spacing w:after="20" w:before="0"/>
             </w:pPr>
-            <w:hyperlink w:history="1" r:id="rIdeyyxafwxfzbftmhtjwcxh">
+            <w:hyperlink w:history="1" r:id="rIdjkuqxgtrcze-l2o8dqpaz">
               <w:r>
                 <w:rPr>
                   <w:rFonts w:ascii="Arial" w:cs="Arial" w:eastAsia="Arial" w:hAnsi="Arial"/>
@@ -27500,7 +27500,7 @@
               <w:spacing w:after="10" w:before="0"/>
               <w:ind w:left="120"/>
             </w:pPr>
-            <w:hyperlink w:history="1" r:id="rId0ko03lfzckahekaz3xled">
+            <w:hyperlink w:history="1" r:id="rIdl6qfa3gktbsd_t6xnz2pb">
               <w:r>
                 <w:rPr>
                   <w:rFonts w:ascii="Arial" w:cs="Arial" w:eastAsia="Arial" w:hAnsi="Arial"/>
@@ -27695,7 +27695,7 @@
             <w:pPr>
               <w:spacing w:after="20" w:before="0"/>
             </w:pPr>
-            <w:hyperlink w:history="1" r:id="rIdnzsqztuq1dbx9ab1mneof">
+            <w:hyperlink w:history="1" r:id="rIdq8_scwvsgisw8zdk3lopm">
               <w:r>
                 <w:rPr>
                   <w:rFonts w:ascii="Arial" w:cs="Arial" w:eastAsia="Arial" w:hAnsi="Arial"/>
@@ -27728,7 +27728,7 @@
               <w:spacing w:after="10" w:before="0"/>
               <w:ind w:left="120"/>
             </w:pPr>
-            <w:hyperlink w:history="1" r:id="rIdzmh07pr-4kpgwpsq6ygve">
+            <w:hyperlink w:history="1" r:id="rIdeua_d_4e0eqjsoqfzjnt2">
               <w:r>
                 <w:rPr>
                   <w:rFonts w:ascii="Arial" w:cs="Arial" w:eastAsia="Arial" w:hAnsi="Arial"/>
@@ -27773,7 +27773,7 @@
             <w:pPr>
               <w:spacing w:after="20" w:before="0"/>
             </w:pPr>
-            <w:hyperlink w:history="1" r:id="rId6hki0lq-fjj2zca9xykxx">
+            <w:hyperlink w:history="1" r:id="rIdatkz5wi7dnzoanizptxss">
               <w:r>
                 <w:rPr>
                   <w:rFonts w:ascii="Arial" w:cs="Arial" w:eastAsia="Arial" w:hAnsi="Arial"/>
@@ -27806,7 +27806,7 @@
               <w:spacing w:after="10" w:before="0"/>
               <w:ind w:left="120"/>
             </w:pPr>
-            <w:hyperlink w:history="1" r:id="rId8yojhgoecx0swcdukevzu">
+            <w:hyperlink w:history="1" r:id="rIdftsl4bi_cd7qew9okf8uj">
               <w:r>
                 <w:rPr>
                   <w:rFonts w:ascii="Arial" w:cs="Arial" w:eastAsia="Arial" w:hAnsi="Arial"/>
@@ -28001,7 +28001,7 @@
             <w:pPr>
               <w:spacing w:after="20" w:before="0"/>
             </w:pPr>
-            <w:hyperlink w:history="1" r:id="rIdragvxydouf0ahx96wsro2">
+            <w:hyperlink w:history="1" r:id="rIdpziufusr7ftiaybcuoln9">
               <w:r>
                 <w:rPr>
                   <w:rFonts w:ascii="Arial" w:cs="Arial" w:eastAsia="Arial" w:hAnsi="Arial"/>
@@ -28034,7 +28034,7 @@
               <w:spacing w:after="10" w:before="0"/>
               <w:ind w:left="120"/>
             </w:pPr>
-            <w:hyperlink w:history="1" r:id="rId4uttm6o8gpxosbkthof_y">
+            <w:hyperlink w:history="1" r:id="rIdbvb6oqwmayvud9ygpuldp">
               <w:r>
                 <w:rPr>
                   <w:rFonts w:ascii="Arial" w:cs="Arial" w:eastAsia="Arial" w:hAnsi="Arial"/>
@@ -28079,7 +28079,7 @@
             <w:pPr>
               <w:spacing w:after="20" w:before="0"/>
             </w:pPr>
-            <w:hyperlink w:history="1" r:id="rIdnw4mbr4nhzszpeorc8ken">
+            <w:hyperlink w:history="1" r:id="rId-tjl3ahts3orkuuu3dxnl">
               <w:r>
                 <w:rPr>
                   <w:rFonts w:ascii="Arial" w:cs="Arial" w:eastAsia="Arial" w:hAnsi="Arial"/>
@@ -28112,7 +28112,7 @@
               <w:spacing w:after="10" w:before="0"/>
               <w:ind w:left="120"/>
             </w:pPr>
-            <w:hyperlink w:history="1" r:id="rIdwxra9ixwp9o24vy29dgrm">
+            <w:hyperlink w:history="1" r:id="rIdzp1q2zoiqqwrlisv0kga9">
               <w:r>
                 <w:rPr>
                   <w:rFonts w:ascii="Arial" w:cs="Arial" w:eastAsia="Arial" w:hAnsi="Arial"/>
@@ -29599,7 +29599,7 @@
             <w:pPr>
               <w:spacing w:after="20" w:before="0"/>
             </w:pPr>
-            <w:hyperlink w:history="1" r:id="rId094telffrlvqfahjo_t2k">
+            <w:hyperlink w:history="1" r:id="rIdgzsvtirwtcgrode_e8gbf">
               <w:r>
                 <w:rPr>
                   <w:rFonts w:ascii="Arial" w:cs="Arial" w:eastAsia="Arial" w:hAnsi="Arial"/>
@@ -29632,7 +29632,7 @@
               <w:spacing w:after="10" w:before="0"/>
               <w:ind w:left="120"/>
             </w:pPr>
-            <w:hyperlink w:history="1" r:id="rIdhmvt0wa52ducxpfcsjy1m">
+            <w:hyperlink w:history="1" r:id="rIdxsawu0qconpr6zjwcghpa">
               <w:r>
                 <w:rPr>
                   <w:rFonts w:ascii="Arial" w:cs="Arial" w:eastAsia="Arial" w:hAnsi="Arial"/>
@@ -29677,7 +29677,7 @@
             <w:pPr>
               <w:spacing w:after="20" w:before="0"/>
             </w:pPr>
-            <w:hyperlink w:history="1" r:id="rIdg3jxhfgtvx3clpsmo_nkx">
+            <w:hyperlink w:history="1" r:id="rIdzfxo3269zvur13_frkgts">
               <w:r>
                 <w:rPr>
                   <w:rFonts w:ascii="Arial" w:cs="Arial" w:eastAsia="Arial" w:hAnsi="Arial"/>
@@ -29710,7 +29710,7 @@
               <w:spacing w:after="10" w:before="0"/>
               <w:ind w:left="120"/>
             </w:pPr>
-            <w:hyperlink w:history="1" r:id="rId5mc8vi9uomp7rz7bntfrz">
+            <w:hyperlink w:history="1" r:id="rIdopwy_scio3kcbuc8uhk3q">
               <w:r>
                 <w:rPr>
                   <w:rFonts w:ascii="Arial" w:cs="Arial" w:eastAsia="Arial" w:hAnsi="Arial"/>
@@ -29905,7 +29905,7 @@
             <w:pPr>
               <w:spacing w:after="20" w:before="0"/>
             </w:pPr>
-            <w:hyperlink w:history="1" r:id="rIddxp0hiuqbwwzpvln5zybc">
+            <w:hyperlink w:history="1" r:id="rIdgyw1g74nvuqkoxjpenggw">
               <w:r>
                 <w:rPr>
                   <w:rFonts w:ascii="Arial" w:cs="Arial" w:eastAsia="Arial" w:hAnsi="Arial"/>
@@ -29938,7 +29938,7 @@
               <w:spacing w:after="10" w:before="0"/>
               <w:ind w:left="120"/>
             </w:pPr>
-            <w:hyperlink w:history="1" r:id="rIddeu3hggotkmri0ub8efl8">
+            <w:hyperlink w:history="1" r:id="rIdumq8xlehpwpv3pqlymxda">
               <w:r>
                 <w:rPr>
                   <w:rFonts w:ascii="Arial" w:cs="Arial" w:eastAsia="Arial" w:hAnsi="Arial"/>
@@ -29983,7 +29983,7 @@
             <w:pPr>
               <w:spacing w:after="20" w:before="0"/>
             </w:pPr>
-            <w:hyperlink w:history="1" r:id="rIdvhde9ye7vvl-kehsqnxhx">
+            <w:hyperlink w:history="1" r:id="rIdpltsq5uqgkqduc_roiwku">
               <w:r>
                 <w:rPr>
                   <w:rFonts w:ascii="Arial" w:cs="Arial" w:eastAsia="Arial" w:hAnsi="Arial"/>
@@ -30016,7 +30016,7 @@
               <w:spacing w:after="10" w:before="0"/>
               <w:ind w:left="120"/>
             </w:pPr>
-            <w:hyperlink w:history="1" r:id="rIdptpgrmacnpnxey9ia5eu2">
+            <w:hyperlink w:history="1" r:id="rIdct6gxzgyrqvc79_7xxfbe">
               <w:r>
                 <w:rPr>
                   <w:rFonts w:ascii="Arial" w:cs="Arial" w:eastAsia="Arial" w:hAnsi="Arial"/>
@@ -30211,7 +30211,7 @@
             <w:pPr>
               <w:spacing w:after="20" w:before="0"/>
             </w:pPr>
-            <w:hyperlink w:history="1" r:id="rIdtmxs3rprsxnnttgibl1hm">
+            <w:hyperlink w:history="1" r:id="rId8vntfjwjpkbu0bzfm9jgi">
               <w:r>
                 <w:rPr>
                   <w:rFonts w:ascii="Arial" w:cs="Arial" w:eastAsia="Arial" w:hAnsi="Arial"/>
@@ -30244,7 +30244,7 @@
               <w:spacing w:after="10" w:before="0"/>
               <w:ind w:left="120"/>
             </w:pPr>
-            <w:hyperlink w:history="1" r:id="rIdgpdnvyfw-3tr9fyovyo9k">
+            <w:hyperlink w:history="1" r:id="rIdpzdrunswgzrrvpskzblyd">
               <w:r>
                 <w:rPr>
                   <w:rFonts w:ascii="Arial" w:cs="Arial" w:eastAsia="Arial" w:hAnsi="Arial"/>
@@ -30289,7 +30289,7 @@
             <w:pPr>
               <w:spacing w:after="20" w:before="0"/>
             </w:pPr>
-            <w:hyperlink w:history="1" r:id="rIdvf5vm3v9zighqsa4y-596">
+            <w:hyperlink w:history="1" r:id="rIdfzmfkiifn-_jpqrrwzrp4">
               <w:r>
                 <w:rPr>
                   <w:rFonts w:ascii="Arial" w:cs="Arial" w:eastAsia="Arial" w:hAnsi="Arial"/>
@@ -30322,7 +30322,7 @@
               <w:spacing w:after="10" w:before="0"/>
               <w:ind w:left="120"/>
             </w:pPr>
-            <w:hyperlink w:history="1" r:id="rId-hlffdns3yqtm2eesvkws">
+            <w:hyperlink w:history="1" r:id="rIdcpxduhtgqcnehgolveyy5">
               <w:r>
                 <w:rPr>
                   <w:rFonts w:ascii="Arial" w:cs="Arial" w:eastAsia="Arial" w:hAnsi="Arial"/>
@@ -30517,7 +30517,7 @@
             <w:pPr>
               <w:spacing w:after="20" w:before="0"/>
             </w:pPr>
-            <w:hyperlink w:history="1" r:id="rId4zqgjjopacvqplybtn4sl">
+            <w:hyperlink w:history="1" r:id="rIdtxktyudfc91m7xug-ua2n">
               <w:r>
                 <w:rPr>
                   <w:rFonts w:ascii="Arial" w:cs="Arial" w:eastAsia="Arial" w:hAnsi="Arial"/>
@@ -30550,7 +30550,7 @@
               <w:spacing w:after="10" w:before="0"/>
               <w:ind w:left="120"/>
             </w:pPr>
-            <w:hyperlink w:history="1" r:id="rIdpgzmncblnprbxwq_va0wf">
+            <w:hyperlink w:history="1" r:id="rIdm-gu2lstqmffossqbctqa">
               <w:r>
                 <w:rPr>
                   <w:rFonts w:ascii="Arial" w:cs="Arial" w:eastAsia="Arial" w:hAnsi="Arial"/>
@@ -30595,7 +30595,7 @@
             <w:pPr>
               <w:spacing w:after="20" w:before="0"/>
             </w:pPr>
-            <w:hyperlink w:history="1" r:id="rIdofqizsnp6kbewxxjx4lcb">
+            <w:hyperlink w:history="1" r:id="rIdshgr6y7o-uoul9pedh5rz">
               <w:r>
                 <w:rPr>
                   <w:rFonts w:ascii="Arial" w:cs="Arial" w:eastAsia="Arial" w:hAnsi="Arial"/>
@@ -30628,7 +30628,7 @@
               <w:spacing w:after="10" w:before="0"/>
               <w:ind w:left="120"/>
             </w:pPr>
-            <w:hyperlink w:history="1" r:id="rIdjfdtiennv4m4orhxaqkqw">
+            <w:hyperlink w:history="1" r:id="rIdevdzqcz562sjrardey1hu">
               <w:r>
                 <w:rPr>
                   <w:rFonts w:ascii="Arial" w:cs="Arial" w:eastAsia="Arial" w:hAnsi="Arial"/>
@@ -30823,7 +30823,7 @@
             <w:pPr>
               <w:spacing w:after="20" w:before="0"/>
             </w:pPr>
-            <w:hyperlink w:history="1" r:id="rIdrrosyit1jxjsidfxqj-z5">
+            <w:hyperlink w:history="1" r:id="rId3b_xw8qoufut9v0njwhz3">
               <w:r>
                 <w:rPr>
                   <w:rFonts w:ascii="Arial" w:cs="Arial" w:eastAsia="Arial" w:hAnsi="Arial"/>
@@ -30856,7 +30856,7 @@
               <w:spacing w:after="10" w:before="0"/>
               <w:ind w:left="120"/>
             </w:pPr>
-            <w:hyperlink w:history="1" r:id="rId0xwuuip4xlerywus-pvy_">
+            <w:hyperlink w:history="1" r:id="rIdfxoceqkoi3kkfv_iswcad">
               <w:r>
                 <w:rPr>
                   <w:rFonts w:ascii="Arial" w:cs="Arial" w:eastAsia="Arial" w:hAnsi="Arial"/>
@@ -30901,7 +30901,7 @@
             <w:pPr>
               <w:spacing w:after="20" w:before="0"/>
             </w:pPr>
-            <w:hyperlink w:history="1" r:id="rIdw9543x1cbbhv6ttp_4qbn">
+            <w:hyperlink w:history="1" r:id="rId35uhtfrnameabjirl9w4g">
               <w:r>
                 <w:rPr>
                   <w:rFonts w:ascii="Arial" w:cs="Arial" w:eastAsia="Arial" w:hAnsi="Arial"/>
@@ -30934,7 +30934,7 @@
               <w:spacing w:after="10" w:before="0"/>
               <w:ind w:left="120"/>
             </w:pPr>
-            <w:hyperlink w:history="1" r:id="rIdwrwggx325davpcjqch8yp">
+            <w:hyperlink w:history="1" r:id="rIdn3zffhgi84tnlofk2i9gt">
               <w:r>
                 <w:rPr>
                   <w:rFonts w:ascii="Arial" w:cs="Arial" w:eastAsia="Arial" w:hAnsi="Arial"/>

</xml_diff>